<commit_message>
Grade 10 revision run complete: all 85 sub-strands revised, built, journals + flagged-items summaries, partner checks pass
Co-Authored-By: Claude Sonnet 5.5 <noreply@anthropic.com>
</commit_message>
<xml_diff>
--- a/data/revised_2026-10_full/outputs/v2/Biology/SS1.1_Cell_Structure/Biology_Cell_Structure_CBE_LessonSequence.docx
+++ b/data/revised_2026-10_full/outputs/v2/Biology/SS1.1_Cell_Structure/Biology_Cell_Structure_CBE_LessonSequence.docx
@@ -2878,7 +2878,7 @@
         </w:rPr>
         <w:t xml:space="preserve">© 2026 SeaVuria and ARES. This work is licensed under a </w:t>
       </w:r>
-      <w:hyperlink w:history="1" r:id="rIdsi84xatjrmyllzbnlx51a">
+      <w:hyperlink w:history="1" r:id="rIdwr2y1z1zbhmgtno4yo0jc">
         <w:r>
           <w:rPr>
             <w:rFonts w:ascii="Arial" w:cs="Arial" w:eastAsia="Arial" w:hAnsi="Arial"/>
@@ -2898,7 +2898,7 @@
         </w:rPr>
         <w:t xml:space="preserve"> (</w:t>
       </w:r>
-      <w:hyperlink w:history="1" r:id="rIdjiw9ux5hvmzvfqic78nf8">
+      <w:hyperlink w:history="1" r:id="rId1q-sr7ioptlbjdwa2jdgn">
         <w:r>
           <w:rPr>
             <w:rFonts w:ascii="Arial" w:cs="Arial" w:eastAsia="Arial" w:hAnsi="Arial"/>
@@ -2918,7 +2918,7 @@
         </w:rPr>
         <w:t xml:space="preserve">). To view a copy of this license, visit </w:t>
       </w:r>
-      <w:hyperlink w:history="1" r:id="rIdpthbw_eadp1abcndr7n9u">
+      <w:hyperlink w:history="1" r:id="rIdqrflgyaefxawqqyytz7je">
         <w:r>
           <w:rPr>
             <w:rFonts w:ascii="Arial" w:cs="Arial" w:eastAsia="Arial" w:hAnsi="Arial"/>
@@ -3957,7 +3957,7 @@
             <w:pPr>
               <w:spacing w:after="20" w:before="0"/>
             </w:pPr>
-            <w:hyperlink w:history="1" r:id="rIdymv48qkkwreq5zcsrscq5">
+            <w:hyperlink w:history="1" r:id="rIdd7kjf5v00erqu_rtvgi0v">
               <w:r>
                 <w:rPr>
                   <w:rFonts w:ascii="Arial" w:cs="Arial" w:eastAsia="Arial" w:hAnsi="Arial"/>
@@ -3990,7 +3990,7 @@
               <w:spacing w:after="10" w:before="0"/>
               <w:ind w:left="120"/>
             </w:pPr>
-            <w:hyperlink w:history="1" r:id="rId-c3uhfx3twdcajjpepqjx">
+            <w:hyperlink w:history="1" r:id="rIdkseskeb0da6qu8ryxkv5w">
               <w:r>
                 <w:rPr>
                   <w:rFonts w:ascii="Arial" w:cs="Arial" w:eastAsia="Arial" w:hAnsi="Arial"/>
@@ -4035,7 +4035,7 @@
             <w:pPr>
               <w:spacing w:after="20" w:before="0"/>
             </w:pPr>
-            <w:hyperlink w:history="1" r:id="rIdaqbr-hbxfwman4ekggycz">
+            <w:hyperlink w:history="1" r:id="rIdataimza05krh2ysqi46gz">
               <w:r>
                 <w:rPr>
                   <w:rFonts w:ascii="Arial" w:cs="Arial" w:eastAsia="Arial" w:hAnsi="Arial"/>
@@ -4068,7 +4068,7 @@
               <w:spacing w:after="10" w:before="0"/>
               <w:ind w:left="120"/>
             </w:pPr>
-            <w:hyperlink w:history="1" r:id="rId2hvvbscand1dmhexk2e9t">
+            <w:hyperlink w:history="1" r:id="rIdqaah9iorzohqdro46f_zv">
               <w:r>
                 <w:rPr>
                   <w:rFonts w:ascii="Arial" w:cs="Arial" w:eastAsia="Arial" w:hAnsi="Arial"/>
@@ -4268,7 +4268,7 @@
             <w:pPr>
               <w:spacing w:after="20" w:before="0"/>
             </w:pPr>
-            <w:hyperlink w:history="1" r:id="rIdtkmzoepshyri4kyzgn7fn">
+            <w:hyperlink w:history="1" r:id="rIdaaz6q3wmxp_nm9d03ixdo">
               <w:r>
                 <w:rPr>
                   <w:rFonts w:ascii="Arial" w:cs="Arial" w:eastAsia="Arial" w:hAnsi="Arial"/>
@@ -4301,7 +4301,7 @@
               <w:spacing w:after="10" w:before="0"/>
               <w:ind w:left="120"/>
             </w:pPr>
-            <w:hyperlink w:history="1" r:id="rIdoaghib1vb1lsqadvucdqc">
+            <w:hyperlink w:history="1" r:id="rIdwlrmpargebjmzbwqxhpum">
               <w:r>
                 <w:rPr>
                   <w:rFonts w:ascii="Arial" w:cs="Arial" w:eastAsia="Arial" w:hAnsi="Arial"/>
@@ -4346,7 +4346,7 @@
             <w:pPr>
               <w:spacing w:after="20" w:before="0"/>
             </w:pPr>
-            <w:hyperlink w:history="1" r:id="rIdtwntxgoyyh75lvkahhigl">
+            <w:hyperlink w:history="1" r:id="rIdhvcypwslunf1ssxubpwal">
               <w:r>
                 <w:rPr>
                   <w:rFonts w:ascii="Arial" w:cs="Arial" w:eastAsia="Arial" w:hAnsi="Arial"/>
@@ -4379,7 +4379,7 @@
               <w:spacing w:after="10" w:before="0"/>
               <w:ind w:left="120"/>
             </w:pPr>
-            <w:hyperlink w:history="1" r:id="rIdbxw7g0cjsukc1kg_l0egj">
+            <w:hyperlink w:history="1" r:id="rIdmcwihfgx18z7g0f80b3j5">
               <w:r>
                 <w:rPr>
                   <w:rFonts w:ascii="Arial" w:cs="Arial" w:eastAsia="Arial" w:hAnsi="Arial"/>
@@ -4579,7 +4579,7 @@
             <w:pPr>
               <w:spacing w:after="20" w:before="0"/>
             </w:pPr>
-            <w:hyperlink w:history="1" r:id="rIdkzzqqhdqlhuefgebcuhna">
+            <w:hyperlink w:history="1" r:id="rIdy4poih-izhypcf2ngyn2w">
               <w:r>
                 <w:rPr>
                   <w:rFonts w:ascii="Arial" w:cs="Arial" w:eastAsia="Arial" w:hAnsi="Arial"/>
@@ -4628,7 +4628,7 @@
               <w:spacing w:after="10" w:before="0"/>
               <w:ind w:left="120"/>
             </w:pPr>
-            <w:hyperlink w:history="1" r:id="rIde8hn8lxn1my1tp7c0km_4">
+            <w:hyperlink w:history="1" r:id="rIdtkcycfrbmdwi_irywjuaz">
               <w:r>
                 <w:rPr>
                   <w:rFonts w:ascii="Arial" w:cs="Arial" w:eastAsia="Arial" w:hAnsi="Arial"/>
@@ -4673,7 +4673,7 @@
             <w:pPr>
               <w:spacing w:after="20" w:before="0"/>
             </w:pPr>
-            <w:hyperlink w:history="1" r:id="rIdcr6gzgwxu4rf0ex7vl-rq">
+            <w:hyperlink w:history="1" r:id="rIdzu7v--egccwww8srsflvq">
               <w:r>
                 <w:rPr>
                   <w:rFonts w:ascii="Arial" w:cs="Arial" w:eastAsia="Arial" w:hAnsi="Arial"/>
@@ -4722,7 +4722,7 @@
               <w:spacing w:after="10" w:before="0"/>
               <w:ind w:left="120"/>
             </w:pPr>
-            <w:hyperlink w:history="1" r:id="rIdhsxedsgdfe7e52wery2i2">
+            <w:hyperlink w:history="1" r:id="rIdgj4gy31oliz45s0jebevq">
               <w:r>
                 <w:rPr>
                   <w:rFonts w:ascii="Arial" w:cs="Arial" w:eastAsia="Arial" w:hAnsi="Arial"/>
@@ -4922,7 +4922,7 @@
             <w:pPr>
               <w:spacing w:after="20" w:before="0"/>
             </w:pPr>
-            <w:hyperlink w:history="1" r:id="rIdu5kjs-i2voeq0c0_jd1s4">
+            <w:hyperlink w:history="1" r:id="rIdsmety7hwzukc3u-denbyw">
               <w:r>
                 <w:rPr>
                   <w:rFonts w:ascii="Arial" w:cs="Arial" w:eastAsia="Arial" w:hAnsi="Arial"/>
@@ -4971,7 +4971,7 @@
               <w:spacing w:after="10" w:before="0"/>
               <w:ind w:left="120"/>
             </w:pPr>
-            <w:hyperlink w:history="1" r:id="rIdkv8r4xkhzg7vr_gc3bpl7">
+            <w:hyperlink w:history="1" r:id="rIdyqvazijnixazvon8zphb9">
               <w:r>
                 <w:rPr>
                   <w:rFonts w:ascii="Arial" w:cs="Arial" w:eastAsia="Arial" w:hAnsi="Arial"/>
@@ -5016,7 +5016,7 @@
             <w:pPr>
               <w:spacing w:after="20" w:before="0"/>
             </w:pPr>
-            <w:hyperlink w:history="1" r:id="rIdseshvlmv8vxqwlgruvfud">
+            <w:hyperlink w:history="1" r:id="rIdcyqcgllfkm_4_4h1yigwg">
               <w:r>
                 <w:rPr>
                   <w:rFonts w:ascii="Arial" w:cs="Arial" w:eastAsia="Arial" w:hAnsi="Arial"/>
@@ -5065,7 +5065,7 @@
               <w:spacing w:after="10" w:before="0"/>
               <w:ind w:left="120"/>
             </w:pPr>
-            <w:hyperlink w:history="1" r:id="rIdqmigsw66gn5kajybryksj">
+            <w:hyperlink w:history="1" r:id="rIdjbxjad58tsfm-8qvltidu">
               <w:r>
                 <w:rPr>
                   <w:rFonts w:ascii="Arial" w:cs="Arial" w:eastAsia="Arial" w:hAnsi="Arial"/>
@@ -5265,7 +5265,7 @@
             <w:pPr>
               <w:spacing w:after="20" w:before="0"/>
             </w:pPr>
-            <w:hyperlink w:history="1" r:id="rIdejvnwagn8lmhqyv7haxiu">
+            <w:hyperlink w:history="1" r:id="rIdfr5goaehkmr6tuaaizbzc">
               <w:r>
                 <w:rPr>
                   <w:rFonts w:ascii="Arial" w:cs="Arial" w:eastAsia="Arial" w:hAnsi="Arial"/>
@@ -5314,7 +5314,7 @@
               <w:spacing w:after="10" w:before="0"/>
               <w:ind w:left="120"/>
             </w:pPr>
-            <w:hyperlink w:history="1" r:id="rIduqoorovshvyillv3rpmst">
+            <w:hyperlink w:history="1" r:id="rId1ekkcpllfpaxe3t4y3snj">
               <w:r>
                 <w:rPr>
                   <w:rFonts w:ascii="Arial" w:cs="Arial" w:eastAsia="Arial" w:hAnsi="Arial"/>
@@ -5359,7 +5359,7 @@
             <w:pPr>
               <w:spacing w:after="20" w:before="0"/>
             </w:pPr>
-            <w:hyperlink w:history="1" r:id="rIdhiyvszunn7xbzgrs0ejga">
+            <w:hyperlink w:history="1" r:id="rIdxq6s6vrpxtbv-odot5ol_">
               <w:r>
                 <w:rPr>
                   <w:rFonts w:ascii="Arial" w:cs="Arial" w:eastAsia="Arial" w:hAnsi="Arial"/>
@@ -5408,7 +5408,7 @@
               <w:spacing w:after="10" w:before="0"/>
               <w:ind w:left="120"/>
             </w:pPr>
-            <w:hyperlink w:history="1" r:id="rIdbikmd0ddlu5pitfi8ura5">
+            <w:hyperlink w:history="1" r:id="rIdy_ha0w00atm6wrmogocfx">
               <w:r>
                 <w:rPr>
                   <w:rFonts w:ascii="Arial" w:cs="Arial" w:eastAsia="Arial" w:hAnsi="Arial"/>
@@ -5933,7 +5933,7 @@
         </w:rPr>
         <w:t xml:space="preserve">© 2026 SeaVuria and ARES. Aligned with KICD objectives. Developed by SeaVuria; technical implementation by ARES (with AI assistance from Claude). Licensed under </w:t>
       </w:r>
-      <w:hyperlink w:history="1" r:id="rId9yhf48h5hnxfa7fqsawza">
+      <w:hyperlink w:history="1" r:id="rIdm_grodo50kqjlxpvhjib0">
         <w:r>
           <w:rPr>
             <w:rFonts w:ascii="Arial" w:cs="Arial" w:eastAsia="Arial" w:hAnsi="Arial"/>
@@ -5954,7 +5954,7 @@
         </w:rPr>
         <w:t xml:space="preserve"> (</w:t>
       </w:r>
-      <w:hyperlink w:history="1" r:id="rIdgmwgcxcxb85x8g2e-p5jv">
+      <w:hyperlink w:history="1" r:id="rId5f1lito2aaac23bujjh5w">
         <w:r>
           <w:rPr>
             <w:rFonts w:ascii="Arial" w:cs="Arial" w:eastAsia="Arial" w:hAnsi="Arial"/>
@@ -6994,7 +6994,7 @@
             <w:pPr>
               <w:spacing w:after="20" w:before="0"/>
             </w:pPr>
-            <w:hyperlink w:history="1" r:id="rIdn5hhkcamgbagnj_b-cbwe">
+            <w:hyperlink w:history="1" r:id="rIddm74on2twhxf-nid8e--n">
               <w:r>
                 <w:rPr>
                   <w:rFonts w:ascii="Arial" w:cs="Arial" w:eastAsia="Arial" w:hAnsi="Arial"/>
@@ -7027,7 +7027,7 @@
               <w:spacing w:after="10" w:before="0"/>
               <w:ind w:left="120"/>
             </w:pPr>
-            <w:hyperlink w:history="1" r:id="rIdxptbjjuxwr8ngqekfvwrb">
+            <w:hyperlink w:history="1" r:id="rIdyzeatziwydtuxrbqim7kj">
               <w:r>
                 <w:rPr>
                   <w:rFonts w:ascii="Arial" w:cs="Arial" w:eastAsia="Arial" w:hAnsi="Arial"/>
@@ -7072,7 +7072,7 @@
             <w:pPr>
               <w:spacing w:after="20" w:before="0"/>
             </w:pPr>
-            <w:hyperlink w:history="1" r:id="rIdskft6b1be-de0myaletnq">
+            <w:hyperlink w:history="1" r:id="rIdgzcka6kvyez3ujsaowf3r">
               <w:r>
                 <w:rPr>
                   <w:rFonts w:ascii="Arial" w:cs="Arial" w:eastAsia="Arial" w:hAnsi="Arial"/>
@@ -7105,7 +7105,7 @@
               <w:spacing w:after="10" w:before="0"/>
               <w:ind w:left="120"/>
             </w:pPr>
-            <w:hyperlink w:history="1" r:id="rIdqgdiy2r-8mn5t0lxazygf">
+            <w:hyperlink w:history="1" r:id="rId24yhu-dwy7aehbcsuirvy">
               <w:r>
                 <w:rPr>
                   <w:rFonts w:ascii="Arial" w:cs="Arial" w:eastAsia="Arial" w:hAnsi="Arial"/>
@@ -7305,7 +7305,7 @@
             <w:pPr>
               <w:spacing w:after="20" w:before="0"/>
             </w:pPr>
-            <w:hyperlink w:history="1" r:id="rIdhxqfqooji-60tkmxh9pk-">
+            <w:hyperlink w:history="1" r:id="rIdswfxjzybglpm4wd4emfxj">
               <w:r>
                 <w:rPr>
                   <w:rFonts w:ascii="Arial" w:cs="Arial" w:eastAsia="Arial" w:hAnsi="Arial"/>
@@ -7338,7 +7338,7 @@
               <w:spacing w:after="10" w:before="0"/>
               <w:ind w:left="120"/>
             </w:pPr>
-            <w:hyperlink w:history="1" r:id="rIdllllbbaosd8o64qxchn9i">
+            <w:hyperlink w:history="1" r:id="rIddlebtrekn-eji96eitq0d">
               <w:r>
                 <w:rPr>
                   <w:rFonts w:ascii="Arial" w:cs="Arial" w:eastAsia="Arial" w:hAnsi="Arial"/>
@@ -7383,7 +7383,7 @@
             <w:pPr>
               <w:spacing w:after="20" w:before="0"/>
             </w:pPr>
-            <w:hyperlink w:history="1" r:id="rIdjf3dk-1bfkirt6xgkm7vl">
+            <w:hyperlink w:history="1" r:id="rIdyboxb90cfc-qwqcyuok7e">
               <w:r>
                 <w:rPr>
                   <w:rFonts w:ascii="Arial" w:cs="Arial" w:eastAsia="Arial" w:hAnsi="Arial"/>
@@ -7416,7 +7416,7 @@
               <w:spacing w:after="10" w:before="0"/>
               <w:ind w:left="120"/>
             </w:pPr>
-            <w:hyperlink w:history="1" r:id="rId1wfohhs6ppdmw_hx_0kkk">
+            <w:hyperlink w:history="1" r:id="rId55t_d5tjrj2q5hwhilhji">
               <w:r>
                 <w:rPr>
                   <w:rFonts w:ascii="Arial" w:cs="Arial" w:eastAsia="Arial" w:hAnsi="Arial"/>
@@ -7616,7 +7616,7 @@
             <w:pPr>
               <w:spacing w:after="20" w:before="0"/>
             </w:pPr>
-            <w:hyperlink w:history="1" r:id="rIdvl4l5iiizeirvuitbyobl">
+            <w:hyperlink w:history="1" r:id="rIdqd3b0l0s4aigez02si2bl">
               <w:r>
                 <w:rPr>
                   <w:rFonts w:ascii="Arial" w:cs="Arial" w:eastAsia="Arial" w:hAnsi="Arial"/>
@@ -7665,7 +7665,7 @@
               <w:spacing w:after="10" w:before="0"/>
               <w:ind w:left="120"/>
             </w:pPr>
-            <w:hyperlink w:history="1" r:id="rId3kmdrz6qxoyhkblntxoo5">
+            <w:hyperlink w:history="1" r:id="rIdlmy4wwpgwlvzdbrt8npto">
               <w:r>
                 <w:rPr>
                   <w:rFonts w:ascii="Arial" w:cs="Arial" w:eastAsia="Arial" w:hAnsi="Arial"/>
@@ -7710,7 +7710,7 @@
             <w:pPr>
               <w:spacing w:after="20" w:before="0"/>
             </w:pPr>
-            <w:hyperlink w:history="1" r:id="rIdqodp8rtpzlnitot8hgzgb">
+            <w:hyperlink w:history="1" r:id="rIdqvt6p2l1bzhxk_yfzjwwo">
               <w:r>
                 <w:rPr>
                   <w:rFonts w:ascii="Arial" w:cs="Arial" w:eastAsia="Arial" w:hAnsi="Arial"/>
@@ -7743,7 +7743,7 @@
               <w:spacing w:after="10" w:before="0"/>
               <w:ind w:left="120"/>
             </w:pPr>
-            <w:hyperlink w:history="1" r:id="rId8kewzl_9smpdkqawtrb5n">
+            <w:hyperlink w:history="1" r:id="rIdyzl692ncybkbwcdfapn55">
               <w:r>
                 <w:rPr>
                   <w:rFonts w:ascii="Arial" w:cs="Arial" w:eastAsia="Arial" w:hAnsi="Arial"/>
@@ -7943,7 +7943,7 @@
             <w:pPr>
               <w:spacing w:after="20" w:before="0"/>
             </w:pPr>
-            <w:hyperlink w:history="1" r:id="rId7w9behpthgfjt2pwokm9v">
+            <w:hyperlink w:history="1" r:id="rIdryx0bemhbknvuliodmpzj">
               <w:r>
                 <w:rPr>
                   <w:rFonts w:ascii="Arial" w:cs="Arial" w:eastAsia="Arial" w:hAnsi="Arial"/>
@@ -7992,7 +7992,7 @@
               <w:spacing w:after="10" w:before="0"/>
               <w:ind w:left="120"/>
             </w:pPr>
-            <w:hyperlink w:history="1" r:id="rIdp6gmgqn0ftogfljq4u-f4">
+            <w:hyperlink w:history="1" r:id="rIdmsuxq4xlj2xfg7-tjq8jo">
               <w:r>
                 <w:rPr>
                   <w:rFonts w:ascii="Arial" w:cs="Arial" w:eastAsia="Arial" w:hAnsi="Arial"/>
@@ -8037,7 +8037,7 @@
             <w:pPr>
               <w:spacing w:after="20" w:before="0"/>
             </w:pPr>
-            <w:hyperlink w:history="1" r:id="rIdehcskgm7scike9bsfmfqs">
+            <w:hyperlink w:history="1" r:id="rIdv_w1hyautb6o4s5q1afil">
               <w:r>
                 <w:rPr>
                   <w:rFonts w:ascii="Arial" w:cs="Arial" w:eastAsia="Arial" w:hAnsi="Arial"/>
@@ -8070,7 +8070,7 @@
               <w:spacing w:after="10" w:before="0"/>
               <w:ind w:left="120"/>
             </w:pPr>
-            <w:hyperlink w:history="1" r:id="rIdjcicqkmwyl96p-fdkyfie">
+            <w:hyperlink w:history="1" r:id="rIdv8teqacgwsok_zrdon74h">
               <w:r>
                 <w:rPr>
                   <w:rFonts w:ascii="Arial" w:cs="Arial" w:eastAsia="Arial" w:hAnsi="Arial"/>
@@ -8270,7 +8270,7 @@
             <w:pPr>
               <w:spacing w:after="20" w:before="0"/>
             </w:pPr>
-            <w:hyperlink w:history="1" r:id="rIdxriipqno3v_b2_ydxveqd">
+            <w:hyperlink w:history="1" r:id="rIdwvxj9k3zrpbhcsode7rgx">
               <w:r>
                 <w:rPr>
                   <w:rFonts w:ascii="Arial" w:cs="Arial" w:eastAsia="Arial" w:hAnsi="Arial"/>
@@ -8319,7 +8319,7 @@
               <w:spacing w:after="10" w:before="0"/>
               <w:ind w:left="120"/>
             </w:pPr>
-            <w:hyperlink w:history="1" r:id="rIdu6ce3l73l4ohrfh_i-agd">
+            <w:hyperlink w:history="1" r:id="rIdp_2u6pm1ihti-pfduc-9w">
               <w:r>
                 <w:rPr>
                   <w:rFonts w:ascii="Arial" w:cs="Arial" w:eastAsia="Arial" w:hAnsi="Arial"/>
@@ -8364,7 +8364,7 @@
             <w:pPr>
               <w:spacing w:after="20" w:before="0"/>
             </w:pPr>
-            <w:hyperlink w:history="1" r:id="rIdsagsag95wkkjfvg7iaspf">
+            <w:hyperlink w:history="1" r:id="rIdd6gqixu5ztxqpw-nzqqtf">
               <w:r>
                 <w:rPr>
                   <w:rFonts w:ascii="Arial" w:cs="Arial" w:eastAsia="Arial" w:hAnsi="Arial"/>
@@ -8397,7 +8397,7 @@
               <w:spacing w:after="10" w:before="0"/>
               <w:ind w:left="120"/>
             </w:pPr>
-            <w:hyperlink w:history="1" r:id="rId4frv8s1jc8mavyh8z5sn_">
+            <w:hyperlink w:history="1" r:id="rIdhp64qz1ajkzj5bapsr-1f">
               <w:r>
                 <w:rPr>
                   <w:rFonts w:ascii="Arial" w:cs="Arial" w:eastAsia="Arial" w:hAnsi="Arial"/>
@@ -8922,7 +8922,7 @@
         </w:rPr>
         <w:t xml:space="preserve">© 2026 SeaVuria and ARES. Aligned with KICD objectives. Developed by SeaVuria; technical implementation by ARES (with AI assistance from Claude). Licensed under </w:t>
       </w:r>
-      <w:hyperlink w:history="1" r:id="rIdrq3mwylxxoes6filvf5yq">
+      <w:hyperlink w:history="1" r:id="rId8pe2ozg4lelmyfqdpbhal">
         <w:r>
           <w:rPr>
             <w:rFonts w:ascii="Arial" w:cs="Arial" w:eastAsia="Arial" w:hAnsi="Arial"/>
@@ -8943,7 +8943,7 @@
         </w:rPr>
         <w:t xml:space="preserve"> (</w:t>
       </w:r>
-      <w:hyperlink w:history="1" r:id="rIdl5igrcy0fhksny_gmgx4v">
+      <w:hyperlink w:history="1" r:id="rIdqzxrtz10tr4s0myqje2sb">
         <w:r>
           <w:rPr>
             <w:rFonts w:ascii="Arial" w:cs="Arial" w:eastAsia="Arial" w:hAnsi="Arial"/>
@@ -9983,7 +9983,7 @@
             <w:pPr>
               <w:spacing w:after="20" w:before="0"/>
             </w:pPr>
-            <w:hyperlink w:history="1" r:id="rIdbygcjyygmvjytvxurds_6">
+            <w:hyperlink w:history="1" r:id="rIdzns2dity-f18rymrgscdr">
               <w:r>
                 <w:rPr>
                   <w:rFonts w:ascii="Arial" w:cs="Arial" w:eastAsia="Arial" w:hAnsi="Arial"/>
@@ -10016,7 +10016,7 @@
               <w:spacing w:after="10" w:before="0"/>
               <w:ind w:left="120"/>
             </w:pPr>
-            <w:hyperlink w:history="1" r:id="rIdcrewt_t3de2nneo76p1k2">
+            <w:hyperlink w:history="1" r:id="rIdtgl8ttzt8szkpkeepd-ey">
               <w:r>
                 <w:rPr>
                   <w:rFonts w:ascii="Arial" w:cs="Arial" w:eastAsia="Arial" w:hAnsi="Arial"/>
@@ -10061,7 +10061,7 @@
             <w:pPr>
               <w:spacing w:after="20" w:before="0"/>
             </w:pPr>
-            <w:hyperlink w:history="1" r:id="rIdrugnphrhj19x7oamsntcz">
+            <w:hyperlink w:history="1" r:id="rIdlnib-d41pbhd-h-syizwv">
               <w:r>
                 <w:rPr>
                   <w:rFonts w:ascii="Arial" w:cs="Arial" w:eastAsia="Arial" w:hAnsi="Arial"/>
@@ -10094,7 +10094,7 @@
               <w:spacing w:after="10" w:before="0"/>
               <w:ind w:left="120"/>
             </w:pPr>
-            <w:hyperlink w:history="1" r:id="rIdxaismu8afyyrvqv1uzfk5">
+            <w:hyperlink w:history="1" r:id="rIdtv9v-9iaaulyyy8uogl95">
               <w:r>
                 <w:rPr>
                   <w:rFonts w:ascii="Arial" w:cs="Arial" w:eastAsia="Arial" w:hAnsi="Arial"/>
@@ -10294,7 +10294,7 @@
             <w:pPr>
               <w:spacing w:after="20" w:before="0"/>
             </w:pPr>
-            <w:hyperlink w:history="1" r:id="rIdjl3pnfq9kwbfspl-ep5ro">
+            <w:hyperlink w:history="1" r:id="rIdhwffrpcqoxbewltz8wf02">
               <w:r>
                 <w:rPr>
                   <w:rFonts w:ascii="Arial" w:cs="Arial" w:eastAsia="Arial" w:hAnsi="Arial"/>
@@ -10327,7 +10327,7 @@
               <w:spacing w:after="10" w:before="0"/>
               <w:ind w:left="120"/>
             </w:pPr>
-            <w:hyperlink w:history="1" r:id="rIdaifjqro-iw-hud2zlxnym">
+            <w:hyperlink w:history="1" r:id="rIdnjhqodw22iwkwutiov5p3">
               <w:r>
                 <w:rPr>
                   <w:rFonts w:ascii="Arial" w:cs="Arial" w:eastAsia="Arial" w:hAnsi="Arial"/>
@@ -10372,7 +10372,7 @@
             <w:pPr>
               <w:spacing w:after="20" w:before="0"/>
             </w:pPr>
-            <w:hyperlink w:history="1" r:id="rIdw-o5i5lz3qmdgeqrccqo5">
+            <w:hyperlink w:history="1" r:id="rIdz4whcx89vurokdyg7quwy">
               <w:r>
                 <w:rPr>
                   <w:rFonts w:ascii="Arial" w:cs="Arial" w:eastAsia="Arial" w:hAnsi="Arial"/>
@@ -10405,7 +10405,7 @@
               <w:spacing w:after="10" w:before="0"/>
               <w:ind w:left="120"/>
             </w:pPr>
-            <w:hyperlink w:history="1" r:id="rIdkiamiaya1rvyfwcwbc9n1">
+            <w:hyperlink w:history="1" r:id="rIdwqpxjwsyqxuxoxwhtoiel">
               <w:r>
                 <w:rPr>
                   <w:rFonts w:ascii="Arial" w:cs="Arial" w:eastAsia="Arial" w:hAnsi="Arial"/>
@@ -10605,7 +10605,7 @@
             <w:pPr>
               <w:spacing w:after="20" w:before="0"/>
             </w:pPr>
-            <w:hyperlink w:history="1" r:id="rIdkmraw3wmhrz_6kt1ssgw-">
+            <w:hyperlink w:history="1" r:id="rId1usvoehiuomvlxdertelz">
               <w:r>
                 <w:rPr>
                   <w:rFonts w:ascii="Arial" w:cs="Arial" w:eastAsia="Arial" w:hAnsi="Arial"/>
@@ -10654,7 +10654,7 @@
               <w:spacing w:after="10" w:before="0"/>
               <w:ind w:left="120"/>
             </w:pPr>
-            <w:hyperlink w:history="1" r:id="rId2hsqj1qpktgcv-vfpfxt4">
+            <w:hyperlink w:history="1" r:id="rIdk87t-3sqq_wphmyzy7_wj">
               <w:r>
                 <w:rPr>
                   <w:rFonts w:ascii="Arial" w:cs="Arial" w:eastAsia="Arial" w:hAnsi="Arial"/>
@@ -10699,7 +10699,7 @@
             <w:pPr>
               <w:spacing w:after="20" w:before="0"/>
             </w:pPr>
-            <w:hyperlink w:history="1" r:id="rIdhkcdrnr3og0-azyumq4ju">
+            <w:hyperlink w:history="1" r:id="rIdjz7dmiriyjoi5rm-9yw0y">
               <w:r>
                 <w:rPr>
                   <w:rFonts w:ascii="Arial" w:cs="Arial" w:eastAsia="Arial" w:hAnsi="Arial"/>
@@ -10732,7 +10732,7 @@
               <w:spacing w:after="10" w:before="0"/>
               <w:ind w:left="120"/>
             </w:pPr>
-            <w:hyperlink w:history="1" r:id="rIdchqyrfbpx_j4186_xuxlw">
+            <w:hyperlink w:history="1" r:id="rId4zmaehr0wf2y649wwp1hf">
               <w:r>
                 <w:rPr>
                   <w:rFonts w:ascii="Arial" w:cs="Arial" w:eastAsia="Arial" w:hAnsi="Arial"/>
@@ -10932,7 +10932,7 @@
             <w:pPr>
               <w:spacing w:after="20" w:before="0"/>
             </w:pPr>
-            <w:hyperlink w:history="1" r:id="rIdto3u0tullnhrvjpdz52fk">
+            <w:hyperlink w:history="1" r:id="rIdpq87znxgnp7jeixxlptii">
               <w:r>
                 <w:rPr>
                   <w:rFonts w:ascii="Arial" w:cs="Arial" w:eastAsia="Arial" w:hAnsi="Arial"/>
@@ -10981,7 +10981,7 @@
               <w:spacing w:after="10" w:before="0"/>
               <w:ind w:left="120"/>
             </w:pPr>
-            <w:hyperlink w:history="1" r:id="rIdfzuiude7-3mqvxy8qxxx2">
+            <w:hyperlink w:history="1" r:id="rIdqsq_ynzvchs1w0ob6z1yt">
               <w:r>
                 <w:rPr>
                   <w:rFonts w:ascii="Arial" w:cs="Arial" w:eastAsia="Arial" w:hAnsi="Arial"/>
@@ -11026,7 +11026,7 @@
             <w:pPr>
               <w:spacing w:after="20" w:before="0"/>
             </w:pPr>
-            <w:hyperlink w:history="1" r:id="rId27eqpjzvt5fzt5bjw8j33">
+            <w:hyperlink w:history="1" r:id="rIdnmbrbqqchd5jusil5iegb">
               <w:r>
                 <w:rPr>
                   <w:rFonts w:ascii="Arial" w:cs="Arial" w:eastAsia="Arial" w:hAnsi="Arial"/>
@@ -11059,7 +11059,7 @@
               <w:spacing w:after="10" w:before="0"/>
               <w:ind w:left="120"/>
             </w:pPr>
-            <w:hyperlink w:history="1" r:id="rIdcx2lijnvozkckmtorydif">
+            <w:hyperlink w:history="1" r:id="rIdh_bmktpetmlszsp9_1kuj">
               <w:r>
                 <w:rPr>
                   <w:rFonts w:ascii="Arial" w:cs="Arial" w:eastAsia="Arial" w:hAnsi="Arial"/>
@@ -11259,7 +11259,7 @@
             <w:pPr>
               <w:spacing w:after="20" w:before="0"/>
             </w:pPr>
-            <w:hyperlink w:history="1" r:id="rIdt6lypcphx-okrqm6rmmlc">
+            <w:hyperlink w:history="1" r:id="rIdmble7o7wcsjjzc-faj-p3">
               <w:r>
                 <w:rPr>
                   <w:rFonts w:ascii="Arial" w:cs="Arial" w:eastAsia="Arial" w:hAnsi="Arial"/>
@@ -11308,7 +11308,7 @@
               <w:spacing w:after="10" w:before="0"/>
               <w:ind w:left="120"/>
             </w:pPr>
-            <w:hyperlink w:history="1" r:id="rIdlrh7aw6trxjfruktxgpkt">
+            <w:hyperlink w:history="1" r:id="rIdh42_jgtzlpngz6lh5nd1x">
               <w:r>
                 <w:rPr>
                   <w:rFonts w:ascii="Arial" w:cs="Arial" w:eastAsia="Arial" w:hAnsi="Arial"/>
@@ -11353,7 +11353,7 @@
             <w:pPr>
               <w:spacing w:after="20" w:before="0"/>
             </w:pPr>
-            <w:hyperlink w:history="1" r:id="rIde6orkdtzdmp3n6jacbqpa">
+            <w:hyperlink w:history="1" r:id="rId_vnsqkk6o3vaahdt-fblj">
               <w:r>
                 <w:rPr>
                   <w:rFonts w:ascii="Arial" w:cs="Arial" w:eastAsia="Arial" w:hAnsi="Arial"/>
@@ -11386,7 +11386,7 @@
               <w:spacing w:after="10" w:before="0"/>
               <w:ind w:left="120"/>
             </w:pPr>
-            <w:hyperlink w:history="1" r:id="rId3ilis4tiyrfougfsc19kn">
+            <w:hyperlink w:history="1" r:id="rIdzirfbvjheqpfybq3ocn3f">
               <w:r>
                 <w:rPr>
                   <w:rFonts w:ascii="Arial" w:cs="Arial" w:eastAsia="Arial" w:hAnsi="Arial"/>
@@ -11911,7 +11911,7 @@
         </w:rPr>
         <w:t xml:space="preserve">© 2026 SeaVuria and ARES. Aligned with KICD objectives. Developed by SeaVuria; technical implementation by ARES (with AI assistance from Claude). Licensed under </w:t>
       </w:r>
-      <w:hyperlink w:history="1" r:id="rIdlyuml2-3tt2mze7mipma_">
+      <w:hyperlink w:history="1" r:id="rIdbddeeaq78ql3-arfbaxqj">
         <w:r>
           <w:rPr>
             <w:rFonts w:ascii="Arial" w:cs="Arial" w:eastAsia="Arial" w:hAnsi="Arial"/>
@@ -11932,7 +11932,7 @@
         </w:rPr>
         <w:t xml:space="preserve"> (</w:t>
       </w:r>
-      <w:hyperlink w:history="1" r:id="rIdwtnxxtrkfdtclgjy7wld9">
+      <w:hyperlink w:history="1" r:id="rIdndagrs6umip9gbbv_fsum">
         <w:r>
           <w:rPr>
             <w:rFonts w:ascii="Arial" w:cs="Arial" w:eastAsia="Arial" w:hAnsi="Arial"/>
@@ -12972,7 +12972,7 @@
             <w:pPr>
               <w:spacing w:after="20" w:before="0"/>
             </w:pPr>
-            <w:hyperlink w:history="1" r:id="rId4k6fcaxbosbzvu38i31fe">
+            <w:hyperlink w:history="1" r:id="rIdkdjdkd5_jypgzauwodtim">
               <w:r>
                 <w:rPr>
                   <w:rFonts w:ascii="Arial" w:cs="Arial" w:eastAsia="Arial" w:hAnsi="Arial"/>
@@ -13005,7 +13005,7 @@
               <w:spacing w:after="10" w:before="0"/>
               <w:ind w:left="120"/>
             </w:pPr>
-            <w:hyperlink w:history="1" r:id="rIdoy65nmrhmehm43dogf3m5">
+            <w:hyperlink w:history="1" r:id="rIdg97fnngrbaof9zupwwq68">
               <w:r>
                 <w:rPr>
                   <w:rFonts w:ascii="Arial" w:cs="Arial" w:eastAsia="Arial" w:hAnsi="Arial"/>
@@ -13050,7 +13050,7 @@
             <w:pPr>
               <w:spacing w:after="20" w:before="0"/>
             </w:pPr>
-            <w:hyperlink w:history="1" r:id="rId1isp7uiit-e9gr9spiofa">
+            <w:hyperlink w:history="1" r:id="rIdy2mapitmq0neykdcs9pom">
               <w:r>
                 <w:rPr>
                   <w:rFonts w:ascii="Arial" w:cs="Arial" w:eastAsia="Arial" w:hAnsi="Arial"/>
@@ -13083,7 +13083,7 @@
               <w:spacing w:after="10" w:before="0"/>
               <w:ind w:left="120"/>
             </w:pPr>
-            <w:hyperlink w:history="1" r:id="rId-trhpwea2nlxeqkndeqph">
+            <w:hyperlink w:history="1" r:id="rIdyggtjo7zrwljjlwam8j8p">
               <w:r>
                 <w:rPr>
                   <w:rFonts w:ascii="Arial" w:cs="Arial" w:eastAsia="Arial" w:hAnsi="Arial"/>
@@ -13283,7 +13283,7 @@
             <w:pPr>
               <w:spacing w:after="20" w:before="0"/>
             </w:pPr>
-            <w:hyperlink w:history="1" r:id="rId36awsktntuy7c6lxg7tv4">
+            <w:hyperlink w:history="1" r:id="rIdtbodhccwmtshncmvt_vy7">
               <w:r>
                 <w:rPr>
                   <w:rFonts w:ascii="Arial" w:cs="Arial" w:eastAsia="Arial" w:hAnsi="Arial"/>
@@ -13316,7 +13316,7 @@
               <w:spacing w:after="10" w:before="0"/>
               <w:ind w:left="120"/>
             </w:pPr>
-            <w:hyperlink w:history="1" r:id="rIdbsrjkkazlclzd-wwethjs">
+            <w:hyperlink w:history="1" r:id="rIdcjobzzt8d1fwjcuiojwwg">
               <w:r>
                 <w:rPr>
                   <w:rFonts w:ascii="Arial" w:cs="Arial" w:eastAsia="Arial" w:hAnsi="Arial"/>
@@ -13361,7 +13361,7 @@
             <w:pPr>
               <w:spacing w:after="20" w:before="0"/>
             </w:pPr>
-            <w:hyperlink w:history="1" r:id="rId_2poqyply9huyf9vu7tsq">
+            <w:hyperlink w:history="1" r:id="rIda2xlemc-gvs-2m51i_1xz">
               <w:r>
                 <w:rPr>
                   <w:rFonts w:ascii="Arial" w:cs="Arial" w:eastAsia="Arial" w:hAnsi="Arial"/>
@@ -13394,7 +13394,7 @@
               <w:spacing w:after="10" w:before="0"/>
               <w:ind w:left="120"/>
             </w:pPr>
-            <w:hyperlink w:history="1" r:id="rIdbbi4wveq1qcbpocno9b90">
+            <w:hyperlink w:history="1" r:id="rIdeyeolxvdgs6aegb_e6tiv">
               <w:r>
                 <w:rPr>
                   <w:rFonts w:ascii="Arial" w:cs="Arial" w:eastAsia="Arial" w:hAnsi="Arial"/>
@@ -13594,7 +13594,7 @@
             <w:pPr>
               <w:spacing w:after="20" w:before="0"/>
             </w:pPr>
-            <w:hyperlink w:history="1" r:id="rIdzrivfmkxascbvmjyaletk">
+            <w:hyperlink w:history="1" r:id="rIdkkl-hvo1xwgbbsdmbydej">
               <w:r>
                 <w:rPr>
                   <w:rFonts w:ascii="Arial" w:cs="Arial" w:eastAsia="Arial" w:hAnsi="Arial"/>
@@ -13627,7 +13627,7 @@
               <w:spacing w:after="10" w:before="0"/>
               <w:ind w:left="120"/>
             </w:pPr>
-            <w:hyperlink w:history="1" r:id="rIda0pz9x91h9dqquoalggem">
+            <w:hyperlink w:history="1" r:id="rIdge48cxneitnyiuvwa13xw">
               <w:r>
                 <w:rPr>
                   <w:rFonts w:ascii="Arial" w:cs="Arial" w:eastAsia="Arial" w:hAnsi="Arial"/>
@@ -13672,7 +13672,7 @@
             <w:pPr>
               <w:spacing w:after="20" w:before="0"/>
             </w:pPr>
-            <w:hyperlink w:history="1" r:id="rIdbjcmndtsx6tm6utnqj2s2">
+            <w:hyperlink w:history="1" r:id="rIdrqlblwnavfz82pfjkwwmv">
               <w:r>
                 <w:rPr>
                   <w:rFonts w:ascii="Arial" w:cs="Arial" w:eastAsia="Arial" w:hAnsi="Arial"/>
@@ -13705,7 +13705,7 @@
               <w:spacing w:after="10" w:before="0"/>
               <w:ind w:left="120"/>
             </w:pPr>
-            <w:hyperlink w:history="1" r:id="rId8d_5eczoldezqpusey3xn">
+            <w:hyperlink w:history="1" r:id="rIddu_uxz6xa0dwlqwiwyfxg">
               <w:r>
                 <w:rPr>
                   <w:rFonts w:ascii="Arial" w:cs="Arial" w:eastAsia="Arial" w:hAnsi="Arial"/>
@@ -14345,7 +14345,7 @@
             <w:pPr>
               <w:spacing w:after="20" w:before="0"/>
             </w:pPr>
-            <w:hyperlink w:history="1" r:id="rIdiuct5m5f7rywhgjkywjvu">
+            <w:hyperlink w:history="1" r:id="rIdg5f7ky65zbxswmxpp6nnr">
               <w:r>
                 <w:rPr>
                   <w:rFonts w:ascii="Arial" w:cs="Arial" w:eastAsia="Arial" w:hAnsi="Arial"/>
@@ -14378,7 +14378,7 @@
               <w:spacing w:after="10" w:before="0"/>
               <w:ind w:left="120"/>
             </w:pPr>
-            <w:hyperlink w:history="1" r:id="rId1as58pvzuc3qnimzhircb">
+            <w:hyperlink w:history="1" r:id="rId6_unxburhfuon7dtjt-l2">
               <w:r>
                 <w:rPr>
                   <w:rFonts w:ascii="Arial" w:cs="Arial" w:eastAsia="Arial" w:hAnsi="Arial"/>
@@ -14423,7 +14423,7 @@
             <w:pPr>
               <w:spacing w:after="20" w:before="0"/>
             </w:pPr>
-            <w:hyperlink w:history="1" r:id="rIdvmn0xmvy4li0sgc-6lai3">
+            <w:hyperlink w:history="1" r:id="rIdigttikfajvcqxj7mkrcqv">
               <w:r>
                 <w:rPr>
                   <w:rFonts w:ascii="Arial" w:cs="Arial" w:eastAsia="Arial" w:hAnsi="Arial"/>
@@ -14456,7 +14456,7 @@
               <w:spacing w:after="10" w:before="0"/>
               <w:ind w:left="120"/>
             </w:pPr>
-            <w:hyperlink w:history="1" r:id="rIdj9vkbvru6bnuzfax-cc7q">
+            <w:hyperlink w:history="1" r:id="rIdbf0bpbqm2mm3peews_szw">
               <w:r>
                 <w:rPr>
                   <w:rFonts w:ascii="Arial" w:cs="Arial" w:eastAsia="Arial" w:hAnsi="Arial"/>
@@ -14656,7 +14656,7 @@
             <w:pPr>
               <w:spacing w:after="20" w:before="0"/>
             </w:pPr>
-            <w:hyperlink w:history="1" r:id="rIdjaej5sea3b2w9qffarjf5">
+            <w:hyperlink w:history="1" r:id="rIdjmacl_ktpumpb1u0imozf">
               <w:r>
                 <w:rPr>
                   <w:rFonts w:ascii="Arial" w:cs="Arial" w:eastAsia="Arial" w:hAnsi="Arial"/>
@@ -14689,7 +14689,7 @@
               <w:spacing w:after="10" w:before="0"/>
               <w:ind w:left="120"/>
             </w:pPr>
-            <w:hyperlink w:history="1" r:id="rIdzuclpcnop4xxww0az99yb">
+            <w:hyperlink w:history="1" r:id="rIdmwkm0bqlaumww-qqhukid">
               <w:r>
                 <w:rPr>
                   <w:rFonts w:ascii="Arial" w:cs="Arial" w:eastAsia="Arial" w:hAnsi="Arial"/>
@@ -14734,7 +14734,7 @@
             <w:pPr>
               <w:spacing w:after="20" w:before="0"/>
             </w:pPr>
-            <w:hyperlink w:history="1" r:id="rIdgnn2358_vtnjmqbzmnji8">
+            <w:hyperlink w:history="1" r:id="rIdmfod9omm8znbfl8udl8al">
               <w:r>
                 <w:rPr>
                   <w:rFonts w:ascii="Arial" w:cs="Arial" w:eastAsia="Arial" w:hAnsi="Arial"/>
@@ -14767,7 +14767,7 @@
               <w:spacing w:after="10" w:before="0"/>
               <w:ind w:left="120"/>
             </w:pPr>
-            <w:hyperlink w:history="1" r:id="rIdd2asmxrsp0ncekojvjjgb">
+            <w:hyperlink w:history="1" r:id="rIdgtdftjkxlo-6mis4f94sc">
               <w:r>
                 <w:rPr>
                   <w:rFonts w:ascii="Arial" w:cs="Arial" w:eastAsia="Arial" w:hAnsi="Arial"/>
@@ -15292,7 +15292,7 @@
         </w:rPr>
         <w:t xml:space="preserve">© 2026 SeaVuria and ARES. Aligned with KICD objectives. Developed by SeaVuria; technical implementation by ARES (with AI assistance from Claude). Licensed under </w:t>
       </w:r>
-      <w:hyperlink w:history="1" r:id="rIdxlq-lxcvf-tycqrreyj9z">
+      <w:hyperlink w:history="1" r:id="rIdp8krfgyxplcksgxzbp3fs">
         <w:r>
           <w:rPr>
             <w:rFonts w:ascii="Arial" w:cs="Arial" w:eastAsia="Arial" w:hAnsi="Arial"/>
@@ -15313,7 +15313,7 @@
         </w:rPr>
         <w:t xml:space="preserve"> (</w:t>
       </w:r>
-      <w:hyperlink w:history="1" r:id="rId_ggdx9nxpvhkcuxnwawcs">
+      <w:hyperlink w:history="1" r:id="rId4fbwxb_34blanqia4jqnx">
         <w:r>
           <w:rPr>
             <w:rFonts w:ascii="Arial" w:cs="Arial" w:eastAsia="Arial" w:hAnsi="Arial"/>
@@ -16353,7 +16353,7 @@
             <w:pPr>
               <w:spacing w:after="20" w:before="0"/>
             </w:pPr>
-            <w:hyperlink w:history="1" r:id="rIdaqy4pf6fjbntdqccyivol">
+            <w:hyperlink w:history="1" r:id="rIdqchv90-buutaqelxy6y5p">
               <w:r>
                 <w:rPr>
                   <w:rFonts w:ascii="Arial" w:cs="Arial" w:eastAsia="Arial" w:hAnsi="Arial"/>
@@ -16386,7 +16386,7 @@
               <w:spacing w:after="10" w:before="0"/>
               <w:ind w:left="120"/>
             </w:pPr>
-            <w:hyperlink w:history="1" r:id="rIdpb_ieifzt0msdaof0vzro">
+            <w:hyperlink w:history="1" r:id="rIdgffjqpoxdl54yjs8hxzqc">
               <w:r>
                 <w:rPr>
                   <w:rFonts w:ascii="Arial" w:cs="Arial" w:eastAsia="Arial" w:hAnsi="Arial"/>
@@ -16431,7 +16431,7 @@
             <w:pPr>
               <w:spacing w:after="20" w:before="0"/>
             </w:pPr>
-            <w:hyperlink w:history="1" r:id="rIdkzqtzivj2nov5rucelmo-">
+            <w:hyperlink w:history="1" r:id="rIdsgd8oa-w52b6iokvm-vxo">
               <w:r>
                 <w:rPr>
                   <w:rFonts w:ascii="Arial" w:cs="Arial" w:eastAsia="Arial" w:hAnsi="Arial"/>
@@ -16464,7 +16464,7 @@
               <w:spacing w:after="10" w:before="0"/>
               <w:ind w:left="120"/>
             </w:pPr>
-            <w:hyperlink w:history="1" r:id="rIdq07bxz3xpvcge6hlg8_p5">
+            <w:hyperlink w:history="1" r:id="rId1h-qilcbin75udtdtal7i">
               <w:r>
                 <w:rPr>
                   <w:rFonts w:ascii="Arial" w:cs="Arial" w:eastAsia="Arial" w:hAnsi="Arial"/>
@@ -16664,7 +16664,7 @@
             <w:pPr>
               <w:spacing w:after="20" w:before="0"/>
             </w:pPr>
-            <w:hyperlink w:history="1" r:id="rId79dtgyokvr9palwn_ycrb">
+            <w:hyperlink w:history="1" r:id="rIdabbeo6misi8rdtb0wd-14">
               <w:r>
                 <w:rPr>
                   <w:rFonts w:ascii="Arial" w:cs="Arial" w:eastAsia="Arial" w:hAnsi="Arial"/>
@@ -16697,7 +16697,7 @@
               <w:spacing w:after="10" w:before="0"/>
               <w:ind w:left="120"/>
             </w:pPr>
-            <w:hyperlink w:history="1" r:id="rIdrfqlxtag7m1gvo1phm_kt">
+            <w:hyperlink w:history="1" r:id="rIdbfblxt-m75f3qhits-oun">
               <w:r>
                 <w:rPr>
                   <w:rFonts w:ascii="Arial" w:cs="Arial" w:eastAsia="Arial" w:hAnsi="Arial"/>
@@ -16742,7 +16742,7 @@
             <w:pPr>
               <w:spacing w:after="20" w:before="0"/>
             </w:pPr>
-            <w:hyperlink w:history="1" r:id="rIdvbt74ruzf_sifg33pkpqk">
+            <w:hyperlink w:history="1" r:id="rIdgstcf5hhuavjqyb3x_1rk">
               <w:r>
                 <w:rPr>
                   <w:rFonts w:ascii="Arial" w:cs="Arial" w:eastAsia="Arial" w:hAnsi="Arial"/>
@@ -16775,7 +16775,7 @@
               <w:spacing w:after="10" w:before="0"/>
               <w:ind w:left="120"/>
             </w:pPr>
-            <w:hyperlink w:history="1" r:id="rIdiheb9b_zsibrqgatwljgy">
+            <w:hyperlink w:history="1" r:id="rIdkthuszmjndwznbrym2tg2">
               <w:r>
                 <w:rPr>
                   <w:rFonts w:ascii="Arial" w:cs="Arial" w:eastAsia="Arial" w:hAnsi="Arial"/>
@@ -16975,7 +16975,7 @@
             <w:pPr>
               <w:spacing w:after="20" w:before="0"/>
             </w:pPr>
-            <w:hyperlink w:history="1" r:id="rIduls4hyyjxxivqrsli7y_u">
+            <w:hyperlink w:history="1" r:id="rIdfiz621wh2wck3wn-raktl">
               <w:r>
                 <w:rPr>
                   <w:rFonts w:ascii="Arial" w:cs="Arial" w:eastAsia="Arial" w:hAnsi="Arial"/>
@@ -17008,7 +17008,7 @@
               <w:spacing w:after="10" w:before="0"/>
               <w:ind w:left="120"/>
             </w:pPr>
-            <w:hyperlink w:history="1" r:id="rIdghtypgct4zqodwswfu2i1">
+            <w:hyperlink w:history="1" r:id="rIdy1o7vvy8fddngsarjhzab">
               <w:r>
                 <w:rPr>
                   <w:rFonts w:ascii="Arial" w:cs="Arial" w:eastAsia="Arial" w:hAnsi="Arial"/>
@@ -17053,7 +17053,7 @@
             <w:pPr>
               <w:spacing w:after="20" w:before="0"/>
             </w:pPr>
-            <w:hyperlink w:history="1" r:id="rId5ahde2ugsprwvsqcv25dh">
+            <w:hyperlink w:history="1" r:id="rId0sutp4cmv6rymhgbmnxz0">
               <w:r>
                 <w:rPr>
                   <w:rFonts w:ascii="Arial" w:cs="Arial" w:eastAsia="Arial" w:hAnsi="Arial"/>
@@ -17102,7 +17102,7 @@
               <w:spacing w:after="10" w:before="0"/>
               <w:ind w:left="120"/>
             </w:pPr>
-            <w:hyperlink w:history="1" r:id="rIdxnfoctkxhxc81fgdp3cuz">
+            <w:hyperlink w:history="1" r:id="rId8emdu4-ru7i3bvez0reo4">
               <w:r>
                 <w:rPr>
                   <w:rFonts w:ascii="Arial" w:cs="Arial" w:eastAsia="Arial" w:hAnsi="Arial"/>
@@ -17302,7 +17302,7 @@
             <w:pPr>
               <w:spacing w:after="20" w:before="0"/>
             </w:pPr>
-            <w:hyperlink w:history="1" r:id="rIdqs4w1fxjdzusg60e1a9wd">
+            <w:hyperlink w:history="1" r:id="rIdu9l4ecfa1jubvohc91dci">
               <w:r>
                 <w:rPr>
                   <w:rFonts w:ascii="Arial" w:cs="Arial" w:eastAsia="Arial" w:hAnsi="Arial"/>
@@ -17335,7 +17335,7 @@
               <w:spacing w:after="10" w:before="0"/>
               <w:ind w:left="120"/>
             </w:pPr>
-            <w:hyperlink w:history="1" r:id="rIdydhve4ehcmtl6irqzh3ar">
+            <w:hyperlink w:history="1" r:id="rIdfqlyvmokyz4osgedyjrsm">
               <w:r>
                 <w:rPr>
                   <w:rFonts w:ascii="Arial" w:cs="Arial" w:eastAsia="Arial" w:hAnsi="Arial"/>
@@ -17380,7 +17380,7 @@
             <w:pPr>
               <w:spacing w:after="20" w:before="0"/>
             </w:pPr>
-            <w:hyperlink w:history="1" r:id="rIdnnbdyq1n-ovxf6antkdu0">
+            <w:hyperlink w:history="1" r:id="rIdb8l7yth-mtr5sz6ubh4bd">
               <w:r>
                 <w:rPr>
                   <w:rFonts w:ascii="Arial" w:cs="Arial" w:eastAsia="Arial" w:hAnsi="Arial"/>
@@ -17429,7 +17429,7 @@
               <w:spacing w:after="10" w:before="0"/>
               <w:ind w:left="120"/>
             </w:pPr>
-            <w:hyperlink w:history="1" r:id="rIdfljzbjas9xlakid-3bedj">
+            <w:hyperlink w:history="1" r:id="rIdv5vfpexv9ullnvamkzklu">
               <w:r>
                 <w:rPr>
                   <w:rFonts w:ascii="Arial" w:cs="Arial" w:eastAsia="Arial" w:hAnsi="Arial"/>
@@ -17629,7 +17629,7 @@
             <w:pPr>
               <w:spacing w:after="20" w:before="0"/>
             </w:pPr>
-            <w:hyperlink w:history="1" r:id="rIdqck9vlfzkb9kdjya2_n8c">
+            <w:hyperlink w:history="1" r:id="rIdrbbzyirlh9gxg9piyd0zq">
               <w:r>
                 <w:rPr>
                   <w:rFonts w:ascii="Arial" w:cs="Arial" w:eastAsia="Arial" w:hAnsi="Arial"/>
@@ -17678,7 +17678,7 @@
               <w:spacing w:after="10" w:before="0"/>
               <w:ind w:left="120"/>
             </w:pPr>
-            <w:hyperlink w:history="1" r:id="rIdft5ehkyjvqfznu-enz8hg">
+            <w:hyperlink w:history="1" r:id="rId5chq_9xgxvmxcqatofiim">
               <w:r>
                 <w:rPr>
                   <w:rFonts w:ascii="Arial" w:cs="Arial" w:eastAsia="Arial" w:hAnsi="Arial"/>
@@ -17723,7 +17723,7 @@
             <w:pPr>
               <w:spacing w:after="20" w:before="0"/>
             </w:pPr>
-            <w:hyperlink w:history="1" r:id="rIdahm44waj3rl_es_yh8gvj">
+            <w:hyperlink w:history="1" r:id="rIdz_obtvzvhck-2kcfazeuj">
               <w:r>
                 <w:rPr>
                   <w:rFonts w:ascii="Arial" w:cs="Arial" w:eastAsia="Arial" w:hAnsi="Arial"/>
@@ -17772,7 +17772,7 @@
               <w:spacing w:after="10" w:before="0"/>
               <w:ind w:left="120"/>
             </w:pPr>
-            <w:hyperlink w:history="1" r:id="rIdcemx0wv_a7zmn8x42bymm">
+            <w:hyperlink w:history="1" r:id="rIdanbyjzbt767ddmitzpcde">
               <w:r>
                 <w:rPr>
                   <w:rFonts w:ascii="Arial" w:cs="Arial" w:eastAsia="Arial" w:hAnsi="Arial"/>
@@ -18297,7 +18297,7 @@
         </w:rPr>
         <w:t xml:space="preserve">© 2026 SeaVuria and ARES. Aligned with KICD objectives. Developed by SeaVuria; technical implementation by ARES (with AI assistance from Claude). Licensed under </w:t>
       </w:r>
-      <w:hyperlink w:history="1" r:id="rIdqqebygv0loreo0slkrjg4">
+      <w:hyperlink w:history="1" r:id="rIdmugv17pxc01rpgvfxvx0-">
         <w:r>
           <w:rPr>
             <w:rFonts w:ascii="Arial" w:cs="Arial" w:eastAsia="Arial" w:hAnsi="Arial"/>
@@ -18318,7 +18318,7 @@
         </w:rPr>
         <w:t xml:space="preserve"> (</w:t>
       </w:r>
-      <w:hyperlink w:history="1" r:id="rId5imp7fivt2gbuvgaxmgzy">
+      <w:hyperlink w:history="1" r:id="rIdxhgidgorr-ut2tluelgwf">
         <w:r>
           <w:rPr>
             <w:rFonts w:ascii="Arial" w:cs="Arial" w:eastAsia="Arial" w:hAnsi="Arial"/>
@@ -19358,7 +19358,7 @@
             <w:pPr>
               <w:spacing w:after="20" w:before="0"/>
             </w:pPr>
-            <w:hyperlink w:history="1" r:id="rIdkmxwmxgw0uyfpp2-ax5pf">
+            <w:hyperlink w:history="1" r:id="rId6sh_gx8dnegteubozbwgx">
               <w:r>
                 <w:rPr>
                   <w:rFonts w:ascii="Arial" w:cs="Arial" w:eastAsia="Arial" w:hAnsi="Arial"/>
@@ -19407,7 +19407,7 @@
               <w:spacing w:after="10" w:before="0"/>
               <w:ind w:left="120"/>
             </w:pPr>
-            <w:hyperlink w:history="1" r:id="rId_dbpegb4dutpxeizqdh8l">
+            <w:hyperlink w:history="1" r:id="rId0wnhgnr-2gy4vp9uxlrun">
               <w:r>
                 <w:rPr>
                   <w:rFonts w:ascii="Arial" w:cs="Arial" w:eastAsia="Arial" w:hAnsi="Arial"/>
@@ -19452,7 +19452,7 @@
             <w:pPr>
               <w:spacing w:after="20" w:before="0"/>
             </w:pPr>
-            <w:hyperlink w:history="1" r:id="rIdouhbktulv_wnmoofafxsc">
+            <w:hyperlink w:history="1" r:id="rIdfpyhewm_u7mudg6wucas6">
               <w:r>
                 <w:rPr>
                   <w:rFonts w:ascii="Arial" w:cs="Arial" w:eastAsia="Arial" w:hAnsi="Arial"/>
@@ -19485,7 +19485,7 @@
               <w:spacing w:after="10" w:before="0"/>
               <w:ind w:left="120"/>
             </w:pPr>
-            <w:hyperlink w:history="1" r:id="rIda9phl_hdyrbye23icinps">
+            <w:hyperlink w:history="1" r:id="rIdxb1hvoo0ztxrc3vecvfoi">
               <w:r>
                 <w:rPr>
                   <w:rFonts w:ascii="Arial" w:cs="Arial" w:eastAsia="Arial" w:hAnsi="Arial"/>
@@ -19685,7 +19685,7 @@
             <w:pPr>
               <w:spacing w:after="20" w:before="0"/>
             </w:pPr>
-            <w:hyperlink w:history="1" r:id="rIdlhb8jyghx9kg2ppy4_n6i">
+            <w:hyperlink w:history="1" r:id="rId06jbglqu-qmhiuiuhuibw">
               <w:r>
                 <w:rPr>
                   <w:rFonts w:ascii="Arial" w:cs="Arial" w:eastAsia="Arial" w:hAnsi="Arial"/>
@@ -19734,7 +19734,7 @@
               <w:spacing w:after="10" w:before="0"/>
               <w:ind w:left="120"/>
             </w:pPr>
-            <w:hyperlink w:history="1" r:id="rIdsqm2ixroeavofzbjfo-sv">
+            <w:hyperlink w:history="1" r:id="rId9vdt9q3hn8zcj1m9wenn9">
               <w:r>
                 <w:rPr>
                   <w:rFonts w:ascii="Arial" w:cs="Arial" w:eastAsia="Arial" w:hAnsi="Arial"/>
@@ -19779,7 +19779,7 @@
             <w:pPr>
               <w:spacing w:after="20" w:before="0"/>
             </w:pPr>
-            <w:hyperlink w:history="1" r:id="rId4v6x4thgev3rnwlwkak4q">
+            <w:hyperlink w:history="1" r:id="rIdbkgugwwr4de6zc2atasby">
               <w:r>
                 <w:rPr>
                   <w:rFonts w:ascii="Arial" w:cs="Arial" w:eastAsia="Arial" w:hAnsi="Arial"/>
@@ -19812,7 +19812,7 @@
               <w:spacing w:after="10" w:before="0"/>
               <w:ind w:left="120"/>
             </w:pPr>
-            <w:hyperlink w:history="1" r:id="rIdga4x7ujs9vgwmypgugyqi">
+            <w:hyperlink w:history="1" r:id="rIdkz0cjn5wj1dzf43g5_-oh">
               <w:r>
                 <w:rPr>
                   <w:rFonts w:ascii="Arial" w:cs="Arial" w:eastAsia="Arial" w:hAnsi="Arial"/>
@@ -20012,7 +20012,7 @@
             <w:pPr>
               <w:spacing w:after="20" w:before="0"/>
             </w:pPr>
-            <w:hyperlink w:history="1" r:id="rIdm0ut0ukpjhmqoqblklnzc">
+            <w:hyperlink w:history="1" r:id="rIdkerxhstckwcdf-o7t0gz2">
               <w:r>
                 <w:rPr>
                   <w:rFonts w:ascii="Arial" w:cs="Arial" w:eastAsia="Arial" w:hAnsi="Arial"/>
@@ -20061,7 +20061,7 @@
               <w:spacing w:after="10" w:before="0"/>
               <w:ind w:left="120"/>
             </w:pPr>
-            <w:hyperlink w:history="1" r:id="rIdhcb30db5ftuc1x0xkptoe">
+            <w:hyperlink w:history="1" r:id="rIdehpigeuhk0tpofzkbee0q">
               <w:r>
                 <w:rPr>
                   <w:rFonts w:ascii="Arial" w:cs="Arial" w:eastAsia="Arial" w:hAnsi="Arial"/>
@@ -20106,7 +20106,7 @@
             <w:pPr>
               <w:spacing w:after="20" w:before="0"/>
             </w:pPr>
-            <w:hyperlink w:history="1" r:id="rIdvgzgo0-adxuwz0431-l8g">
+            <w:hyperlink w:history="1" r:id="rIddouv253bnooglwxds0ckj">
               <w:r>
                 <w:rPr>
                   <w:rFonts w:ascii="Arial" w:cs="Arial" w:eastAsia="Arial" w:hAnsi="Arial"/>
@@ -20139,7 +20139,7 @@
               <w:spacing w:after="10" w:before="0"/>
               <w:ind w:left="120"/>
             </w:pPr>
-            <w:hyperlink w:history="1" r:id="rId0hbzbbdhzldqfmicop3px">
+            <w:hyperlink w:history="1" r:id="rId3vkukptibury8tsrfcz5f">
               <w:r>
                 <w:rPr>
                   <w:rFonts w:ascii="Arial" w:cs="Arial" w:eastAsia="Arial" w:hAnsi="Arial"/>
@@ -20339,7 +20339,7 @@
             <w:pPr>
               <w:spacing w:after="20" w:before="0"/>
             </w:pPr>
-            <w:hyperlink w:history="1" r:id="rIdxdtuycwqskbhpv7wgss7d">
+            <w:hyperlink w:history="1" r:id="rId2etu4m7-mnk3mibieor7a">
               <w:r>
                 <w:rPr>
                   <w:rFonts w:ascii="Arial" w:cs="Arial" w:eastAsia="Arial" w:hAnsi="Arial"/>
@@ -20388,7 +20388,7 @@
               <w:spacing w:after="10" w:before="0"/>
               <w:ind w:left="120"/>
             </w:pPr>
-            <w:hyperlink w:history="1" r:id="rIdacegdmqt41bxmhxyxdzpc">
+            <w:hyperlink w:history="1" r:id="rIdpsde6axwpdqkgajhn4nib">
               <w:r>
                 <w:rPr>
                   <w:rFonts w:ascii="Arial" w:cs="Arial" w:eastAsia="Arial" w:hAnsi="Arial"/>
@@ -20433,7 +20433,7 @@
             <w:pPr>
               <w:spacing w:after="20" w:before="0"/>
             </w:pPr>
-            <w:hyperlink w:history="1" r:id="rId_jdtjin9tfvaawrjj48lp">
+            <w:hyperlink w:history="1" r:id="rId4uh81ud1jyqo_0rgdbdep">
               <w:r>
                 <w:rPr>
                   <w:rFonts w:ascii="Arial" w:cs="Arial" w:eastAsia="Arial" w:hAnsi="Arial"/>
@@ -20466,7 +20466,7 @@
               <w:spacing w:after="10" w:before="0"/>
               <w:ind w:left="120"/>
             </w:pPr>
-            <w:hyperlink w:history="1" r:id="rIdnovj0qdw1zmt_tinspbss">
+            <w:hyperlink w:history="1" r:id="rIdeztrfi4bg-dqigntlhym6">
               <w:r>
                 <w:rPr>
                   <w:rFonts w:ascii="Arial" w:cs="Arial" w:eastAsia="Arial" w:hAnsi="Arial"/>
@@ -20666,7 +20666,7 @@
             <w:pPr>
               <w:spacing w:after="20" w:before="0"/>
             </w:pPr>
-            <w:hyperlink w:history="1" r:id="rId81gevrxbrqrvmsuuigrma">
+            <w:hyperlink w:history="1" r:id="rIdphbp4ejzu340pwk4anlgl">
               <w:r>
                 <w:rPr>
                   <w:rFonts w:ascii="Arial" w:cs="Arial" w:eastAsia="Arial" w:hAnsi="Arial"/>
@@ -20715,7 +20715,7 @@
               <w:spacing w:after="10" w:before="0"/>
               <w:ind w:left="120"/>
             </w:pPr>
-            <w:hyperlink w:history="1" r:id="rIdz2z3zclsqyxacjrerk-pz">
+            <w:hyperlink w:history="1" r:id="rIdufvjfhmyqqnkmteifxcbt">
               <w:r>
                 <w:rPr>
                   <w:rFonts w:ascii="Arial" w:cs="Arial" w:eastAsia="Arial" w:hAnsi="Arial"/>
@@ -20760,7 +20760,7 @@
             <w:pPr>
               <w:spacing w:after="20" w:before="0"/>
             </w:pPr>
-            <w:hyperlink w:history="1" r:id="rIdhhnkm0dva7svkxxl2ekwu">
+            <w:hyperlink w:history="1" r:id="rIdgfl6fq7tc3-dyghyid31s">
               <w:r>
                 <w:rPr>
                   <w:rFonts w:ascii="Arial" w:cs="Arial" w:eastAsia="Arial" w:hAnsi="Arial"/>
@@ -20793,7 +20793,7 @@
               <w:spacing w:after="10" w:before="0"/>
               <w:ind w:left="120"/>
             </w:pPr>
-            <w:hyperlink w:history="1" r:id="rIdl2y59xqdza2nur1vvjvch">
+            <w:hyperlink w:history="1" r:id="rIdpmpvr-qffmb1tpj9d29yv">
               <w:r>
                 <w:rPr>
                   <w:rFonts w:ascii="Arial" w:cs="Arial" w:eastAsia="Arial" w:hAnsi="Arial"/>
@@ -21418,7 +21418,7 @@
         </w:rPr>
         <w:t xml:space="preserve">© 2026 SeaVuria and ARES. Aligned with KICD objectives. Developed by SeaVuria; technical implementation by ARES (with AI assistance from Claude). Licensed under </w:t>
       </w:r>
-      <w:hyperlink w:history="1" r:id="rId8xkcmot03q9su70dtnlsm">
+      <w:hyperlink w:history="1" r:id="rIdbqobuqizpr7ncbfrgbyhy">
         <w:r>
           <w:rPr>
             <w:rFonts w:ascii="Arial" w:cs="Arial" w:eastAsia="Arial" w:hAnsi="Arial"/>
@@ -21439,7 +21439,7 @@
         </w:rPr>
         <w:t xml:space="preserve"> (</w:t>
       </w:r>
-      <w:hyperlink w:history="1" r:id="rId0lgqz3fr7xtmvupkqgo9e">
+      <w:hyperlink w:history="1" r:id="rIdd_lt1hmbqjjqgvspo2fst">
         <w:r>
           <w:rPr>
             <w:rFonts w:ascii="Arial" w:cs="Arial" w:eastAsia="Arial" w:hAnsi="Arial"/>
@@ -22479,7 +22479,7 @@
             <w:pPr>
               <w:spacing w:after="20" w:before="0"/>
             </w:pPr>
-            <w:hyperlink w:history="1" r:id="rIdqvdo9h0brrkxfjpdxzgh9">
+            <w:hyperlink w:history="1" r:id="rId1dtypgkrht16cbknqycv3">
               <w:r>
                 <w:rPr>
                   <w:rFonts w:ascii="Arial" w:cs="Arial" w:eastAsia="Arial" w:hAnsi="Arial"/>
@@ -22512,7 +22512,7 @@
               <w:spacing w:after="10" w:before="0"/>
               <w:ind w:left="120"/>
             </w:pPr>
-            <w:hyperlink w:history="1" r:id="rIdbf9yzoxcbeqsdkzpf_urb">
+            <w:hyperlink w:history="1" r:id="rIdaskcvh6zdcwfiwr1dbqa3">
               <w:r>
                 <w:rPr>
                   <w:rFonts w:ascii="Arial" w:cs="Arial" w:eastAsia="Arial" w:hAnsi="Arial"/>
@@ -22557,7 +22557,7 @@
             <w:pPr>
               <w:spacing w:after="20" w:before="0"/>
             </w:pPr>
-            <w:hyperlink w:history="1" r:id="rId6bjnrxrf781i0s49fhmtv">
+            <w:hyperlink w:history="1" r:id="rId5vwxg8p9d5jtb44-qib5l">
               <w:r>
                 <w:rPr>
                   <w:rFonts w:ascii="Arial" w:cs="Arial" w:eastAsia="Arial" w:hAnsi="Arial"/>
@@ -22590,7 +22590,7 @@
               <w:spacing w:after="10" w:before="0"/>
               <w:ind w:left="120"/>
             </w:pPr>
-            <w:hyperlink w:history="1" r:id="rIdlrg1xvpbqpki1gsf_l-pc">
+            <w:hyperlink w:history="1" r:id="rIdbcykdynyqwg1jpp53nbkz">
               <w:r>
                 <w:rPr>
                   <w:rFonts w:ascii="Arial" w:cs="Arial" w:eastAsia="Arial" w:hAnsi="Arial"/>
@@ -22790,7 +22790,7 @@
             <w:pPr>
               <w:spacing w:after="20" w:before="0"/>
             </w:pPr>
-            <w:hyperlink w:history="1" r:id="rId6wlv_u_8bvh-iwvbdvn2q">
+            <w:hyperlink w:history="1" r:id="rIdos--yhhoxgl73quo1vta2">
               <w:r>
                 <w:rPr>
                   <w:rFonts w:ascii="Arial" w:cs="Arial" w:eastAsia="Arial" w:hAnsi="Arial"/>
@@ -22823,7 +22823,7 @@
               <w:spacing w:after="10" w:before="0"/>
               <w:ind w:left="120"/>
             </w:pPr>
-            <w:hyperlink w:history="1" r:id="rId5horekae6ypfptf7ojrof">
+            <w:hyperlink w:history="1" r:id="rIddw8e2oz72omx1wixz7vj4">
               <w:r>
                 <w:rPr>
                   <w:rFonts w:ascii="Arial" w:cs="Arial" w:eastAsia="Arial" w:hAnsi="Arial"/>
@@ -22868,7 +22868,7 @@
             <w:pPr>
               <w:spacing w:after="20" w:before="0"/>
             </w:pPr>
-            <w:hyperlink w:history="1" r:id="rIditukokyaxjze92xfw1zvg">
+            <w:hyperlink w:history="1" r:id="rIdpqq6yhjszoip5q-jw55le">
               <w:r>
                 <w:rPr>
                   <w:rFonts w:ascii="Arial" w:cs="Arial" w:eastAsia="Arial" w:hAnsi="Arial"/>
@@ -22901,7 +22901,7 @@
               <w:spacing w:after="10" w:before="0"/>
               <w:ind w:left="120"/>
             </w:pPr>
-            <w:hyperlink w:history="1" r:id="rIdk4rp3vbdyyao-d-qnf7wd">
+            <w:hyperlink w:history="1" r:id="rIdjmvrolxk7rbilnonmqofn">
               <w:r>
                 <w:rPr>
                   <w:rFonts w:ascii="Arial" w:cs="Arial" w:eastAsia="Arial" w:hAnsi="Arial"/>
@@ -23101,7 +23101,7 @@
             <w:pPr>
               <w:spacing w:after="20" w:before="0"/>
             </w:pPr>
-            <w:hyperlink w:history="1" r:id="rIda3arawaxxqc8uw2hz8vaq">
+            <w:hyperlink w:history="1" r:id="rIdr56z1m4o9aa_9jc15e4rx">
               <w:r>
                 <w:rPr>
                   <w:rFonts w:ascii="Arial" w:cs="Arial" w:eastAsia="Arial" w:hAnsi="Arial"/>
@@ -23150,7 +23150,7 @@
               <w:spacing w:after="10" w:before="0"/>
               <w:ind w:left="120"/>
             </w:pPr>
-            <w:hyperlink w:history="1" r:id="rIdso16crpipc3gsqrtno0vr">
+            <w:hyperlink w:history="1" r:id="rIduggzctpa--qfcxc-1eogh">
               <w:r>
                 <w:rPr>
                   <w:rFonts w:ascii="Arial" w:cs="Arial" w:eastAsia="Arial" w:hAnsi="Arial"/>
@@ -23195,7 +23195,7 @@
             <w:pPr>
               <w:spacing w:after="20" w:before="0"/>
             </w:pPr>
-            <w:hyperlink w:history="1" r:id="rIdcgzzybjsw6tqwmjhze5-1">
+            <w:hyperlink w:history="1" r:id="rId3ukcokfazvzciuh-cgimk">
               <w:r>
                 <w:rPr>
                   <w:rFonts w:ascii="Arial" w:cs="Arial" w:eastAsia="Arial" w:hAnsi="Arial"/>
@@ -23244,7 +23244,7 @@
               <w:spacing w:after="10" w:before="0"/>
               <w:ind w:left="120"/>
             </w:pPr>
-            <w:hyperlink w:history="1" r:id="rIdizfaaxvu_xzdedra6ta4x">
+            <w:hyperlink w:history="1" r:id="rIdxxay-2j_sncst1wnbp3x0">
               <w:r>
                 <w:rPr>
                   <w:rFonts w:ascii="Arial" w:cs="Arial" w:eastAsia="Arial" w:hAnsi="Arial"/>
@@ -23444,7 +23444,7 @@
             <w:pPr>
               <w:spacing w:after="20" w:before="0"/>
             </w:pPr>
-            <w:hyperlink w:history="1" r:id="rId-hlfjhj58pzvzrlh_if44">
+            <w:hyperlink w:history="1" r:id="rIdl52xgmxvg7kgdaqx-gkl9">
               <w:r>
                 <w:rPr>
                   <w:rFonts w:ascii="Arial" w:cs="Arial" w:eastAsia="Arial" w:hAnsi="Arial"/>
@@ -23493,7 +23493,7 @@
               <w:spacing w:after="10" w:before="0"/>
               <w:ind w:left="120"/>
             </w:pPr>
-            <w:hyperlink w:history="1" r:id="rIdcu14uscjkamw7uo2ggw1m">
+            <w:hyperlink w:history="1" r:id="rIdhnuubgosefju8zesgwvor">
               <w:r>
                 <w:rPr>
                   <w:rFonts w:ascii="Arial" w:cs="Arial" w:eastAsia="Arial" w:hAnsi="Arial"/>
@@ -23538,7 +23538,7 @@
             <w:pPr>
               <w:spacing w:after="20" w:before="0"/>
             </w:pPr>
-            <w:hyperlink w:history="1" r:id="rIdtremtqoonqm7kwn2yrclk">
+            <w:hyperlink w:history="1" r:id="rId14ivnu21w2aw6lui2g1db">
               <w:r>
                 <w:rPr>
                   <w:rFonts w:ascii="Arial" w:cs="Arial" w:eastAsia="Arial" w:hAnsi="Arial"/>
@@ -23587,7 +23587,7 @@
               <w:spacing w:after="10" w:before="0"/>
               <w:ind w:left="120"/>
             </w:pPr>
-            <w:hyperlink w:history="1" r:id="rIdvaihfsarbnvtjulcjlhy0">
+            <w:hyperlink w:history="1" r:id="rId4-sfdbduv2bsf5vc4xxgw">
               <w:r>
                 <w:rPr>
                   <w:rFonts w:ascii="Arial" w:cs="Arial" w:eastAsia="Arial" w:hAnsi="Arial"/>
@@ -23787,7 +23787,7 @@
             <w:pPr>
               <w:spacing w:after="20" w:before="0"/>
             </w:pPr>
-            <w:hyperlink w:history="1" r:id="rId8ujwxqndadqqrq4r3tna9">
+            <w:hyperlink w:history="1" r:id="rIdgj_l9nydu23v7zsw184le">
               <w:r>
                 <w:rPr>
                   <w:rFonts w:ascii="Arial" w:cs="Arial" w:eastAsia="Arial" w:hAnsi="Arial"/>
@@ -23836,7 +23836,7 @@
               <w:spacing w:after="10" w:before="0"/>
               <w:ind w:left="120"/>
             </w:pPr>
-            <w:hyperlink w:history="1" r:id="rId8t36m2xeatvmv4w2awfnk">
+            <w:hyperlink w:history="1" r:id="rId41wvcsuxbr38lusikorsq">
               <w:r>
                 <w:rPr>
                   <w:rFonts w:ascii="Arial" w:cs="Arial" w:eastAsia="Arial" w:hAnsi="Arial"/>
@@ -23881,7 +23881,7 @@
             <w:pPr>
               <w:spacing w:after="20" w:before="0"/>
             </w:pPr>
-            <w:hyperlink w:history="1" r:id="rIdwwpvwo2t2ba0mkyzolzpm">
+            <w:hyperlink w:history="1" r:id="rIdda54vcz8orcps0rh8zpu5">
               <w:r>
                 <w:rPr>
                   <w:rFonts w:ascii="Arial" w:cs="Arial" w:eastAsia="Arial" w:hAnsi="Arial"/>
@@ -23930,7 +23930,7 @@
               <w:spacing w:after="10" w:before="0"/>
               <w:ind w:left="120"/>
             </w:pPr>
-            <w:hyperlink w:history="1" r:id="rIdiupf3rwo3-fmuipxhvap8">
+            <w:hyperlink w:history="1" r:id="rIdwj1uh3dmldb2ayqrtbyyh">
               <w:r>
                 <w:rPr>
                   <w:rFonts w:ascii="Arial" w:cs="Arial" w:eastAsia="Arial" w:hAnsi="Arial"/>
@@ -24575,7 +24575,7 @@
         </w:rPr>
         <w:t xml:space="preserve">© 2026 SeaVuria and ARES. Aligned with KICD objectives. Developed by SeaVuria; technical implementation by ARES (with AI assistance from Claude). Licensed under </w:t>
       </w:r>
-      <w:hyperlink w:history="1" r:id="rIdnub6_vtztwk1ay4udfk43">
+      <w:hyperlink w:history="1" r:id="rIddnakncc8fzg0twsrtwznm">
         <w:r>
           <w:rPr>
             <w:rFonts w:ascii="Arial" w:cs="Arial" w:eastAsia="Arial" w:hAnsi="Arial"/>
@@ -24596,7 +24596,7 @@
         </w:rPr>
         <w:t xml:space="preserve"> (</w:t>
       </w:r>
-      <w:hyperlink w:history="1" r:id="rIdnwrjqdd67h5sfctb1umww">
+      <w:hyperlink w:history="1" r:id="rIdbwpax2w1z8aacvyv9vlbs">
         <w:r>
           <w:rPr>
             <w:rFonts w:ascii="Arial" w:cs="Arial" w:eastAsia="Arial" w:hAnsi="Arial"/>
@@ -25636,7 +25636,7 @@
             <w:pPr>
               <w:spacing w:after="20" w:before="0"/>
             </w:pPr>
-            <w:hyperlink w:history="1" r:id="rIdose8ean7w6m-5ng9z_9oq">
+            <w:hyperlink w:history="1" r:id="rIdn7pjwl_a7k3a9ambpd-hf">
               <w:r>
                 <w:rPr>
                   <w:rFonts w:ascii="Arial" w:cs="Arial" w:eastAsia="Arial" w:hAnsi="Arial"/>
@@ -25669,7 +25669,7 @@
               <w:spacing w:after="10" w:before="0"/>
               <w:ind w:left="120"/>
             </w:pPr>
-            <w:hyperlink w:history="1" r:id="rIdvu2j8u0jwmdnidjsgjssx">
+            <w:hyperlink w:history="1" r:id="rIdvcwvg6qy_x2q5ejp6dxyf">
               <w:r>
                 <w:rPr>
                   <w:rFonts w:ascii="Arial" w:cs="Arial" w:eastAsia="Arial" w:hAnsi="Arial"/>
@@ -25714,7 +25714,7 @@
             <w:pPr>
               <w:spacing w:after="20" w:before="0"/>
             </w:pPr>
-            <w:hyperlink w:history="1" r:id="rId3g1xkw0nzrz14q4qyobuf">
+            <w:hyperlink w:history="1" r:id="rIduh0hueouki_fyvjzi5hr2">
               <w:r>
                 <w:rPr>
                   <w:rFonts w:ascii="Arial" w:cs="Arial" w:eastAsia="Arial" w:hAnsi="Arial"/>
@@ -25747,7 +25747,7 @@
               <w:spacing w:after="10" w:before="0"/>
               <w:ind w:left="120"/>
             </w:pPr>
-            <w:hyperlink w:history="1" r:id="rId0br4ngslqqj006jmfzs8x">
+            <w:hyperlink w:history="1" r:id="rIdxwdtcopn3ttsyr_gwbtw5">
               <w:r>
                 <w:rPr>
                   <w:rFonts w:ascii="Arial" w:cs="Arial" w:eastAsia="Arial" w:hAnsi="Arial"/>
@@ -25947,7 +25947,7 @@
             <w:pPr>
               <w:spacing w:after="20" w:before="0"/>
             </w:pPr>
-            <w:hyperlink w:history="1" r:id="rId1mtucdygspdep-2gjiehj">
+            <w:hyperlink w:history="1" r:id="rIdjj4r_ssi7b8dpn68syhit">
               <w:r>
                 <w:rPr>
                   <w:rFonts w:ascii="Arial" w:cs="Arial" w:eastAsia="Arial" w:hAnsi="Arial"/>
@@ -25980,7 +25980,7 @@
               <w:spacing w:after="10" w:before="0"/>
               <w:ind w:left="120"/>
             </w:pPr>
-            <w:hyperlink w:history="1" r:id="rIdmay98jtk9llffo5d8fz3w">
+            <w:hyperlink w:history="1" r:id="rId8slgedgopdjsgfp5cq-xe">
               <w:r>
                 <w:rPr>
                   <w:rFonts w:ascii="Arial" w:cs="Arial" w:eastAsia="Arial" w:hAnsi="Arial"/>
@@ -26025,7 +26025,7 @@
             <w:pPr>
               <w:spacing w:after="20" w:before="0"/>
             </w:pPr>
-            <w:hyperlink w:history="1" r:id="rId5zixvg_bmpsnz70ohtwvm">
+            <w:hyperlink w:history="1" r:id="rIds9vthwgixhdcvv4umoqud">
               <w:r>
                 <w:rPr>
                   <w:rFonts w:ascii="Arial" w:cs="Arial" w:eastAsia="Arial" w:hAnsi="Arial"/>
@@ -26058,7 +26058,7 @@
               <w:spacing w:after="10" w:before="0"/>
               <w:ind w:left="120"/>
             </w:pPr>
-            <w:hyperlink w:history="1" r:id="rIdkiwqz_abhq5kvbnsuvgqc">
+            <w:hyperlink w:history="1" r:id="rIdi6y_4dnawud03a-xlmomx">
               <w:r>
                 <w:rPr>
                   <w:rFonts w:ascii="Arial" w:cs="Arial" w:eastAsia="Arial" w:hAnsi="Arial"/>
@@ -26258,7 +26258,7 @@
             <w:pPr>
               <w:spacing w:after="20" w:before="0"/>
             </w:pPr>
-            <w:hyperlink w:history="1" r:id="rIdtxttdvynuoxuizrngpotl">
+            <w:hyperlink w:history="1" r:id="rIdm4fyzxu6vhwwx9ff2d0av">
               <w:r>
                 <w:rPr>
                   <w:rFonts w:ascii="Arial" w:cs="Arial" w:eastAsia="Arial" w:hAnsi="Arial"/>
@@ -26291,7 +26291,7 @@
               <w:spacing w:after="10" w:before="0"/>
               <w:ind w:left="120"/>
             </w:pPr>
-            <w:hyperlink w:history="1" r:id="rIdzbrika77wkn0wzbsgts7b">
+            <w:hyperlink w:history="1" r:id="rIdgsx67oczcpgrwke9ozh_3">
               <w:r>
                 <w:rPr>
                   <w:rFonts w:ascii="Arial" w:cs="Arial" w:eastAsia="Arial" w:hAnsi="Arial"/>
@@ -26336,7 +26336,7 @@
             <w:pPr>
               <w:spacing w:after="20" w:before="0"/>
             </w:pPr>
-            <w:hyperlink w:history="1" r:id="rIddo9hkiidh8lm2jiojxaxk">
+            <w:hyperlink w:history="1" r:id="rIdhlcaddngi-fczevonh1or">
               <w:r>
                 <w:rPr>
                   <w:rFonts w:ascii="Arial" w:cs="Arial" w:eastAsia="Arial" w:hAnsi="Arial"/>
@@ -26369,7 +26369,7 @@
               <w:spacing w:after="10" w:before="0"/>
               <w:ind w:left="120"/>
             </w:pPr>
-            <w:hyperlink w:history="1" r:id="rId-2jtqiu5yvuzf0tyzjxsu">
+            <w:hyperlink w:history="1" r:id="rIdnn_sunselmm5bywrz39ti">
               <w:r>
                 <w:rPr>
                   <w:rFonts w:ascii="Arial" w:cs="Arial" w:eastAsia="Arial" w:hAnsi="Arial"/>
@@ -26569,7 +26569,7 @@
             <w:pPr>
               <w:spacing w:after="20" w:before="0"/>
             </w:pPr>
-            <w:hyperlink w:history="1" r:id="rIdkszqkn2v_8mkcgzi6qqew">
+            <w:hyperlink w:history="1" r:id="rIdixduvcizxzfsklanjktqf">
               <w:r>
                 <w:rPr>
                   <w:rFonts w:ascii="Arial" w:cs="Arial" w:eastAsia="Arial" w:hAnsi="Arial"/>
@@ -26602,7 +26602,7 @@
               <w:spacing w:after="10" w:before="0"/>
               <w:ind w:left="120"/>
             </w:pPr>
-            <w:hyperlink w:history="1" r:id="rIdsr-er10vh7olzne2yfogc">
+            <w:hyperlink w:history="1" r:id="rIdog4zwbavcssjd_wtkiibf">
               <w:r>
                 <w:rPr>
                   <w:rFonts w:ascii="Arial" w:cs="Arial" w:eastAsia="Arial" w:hAnsi="Arial"/>
@@ -26647,7 +26647,7 @@
             <w:pPr>
               <w:spacing w:after="20" w:before="0"/>
             </w:pPr>
-            <w:hyperlink w:history="1" r:id="rIdrenipnewtb6d3ipevhpoc">
+            <w:hyperlink w:history="1" r:id="rIdwncgzpdbnmgakxlmfgmtd">
               <w:r>
                 <w:rPr>
                   <w:rFonts w:ascii="Arial" w:cs="Arial" w:eastAsia="Arial" w:hAnsi="Arial"/>
@@ -26680,7 +26680,7 @@
               <w:spacing w:after="10" w:before="0"/>
               <w:ind w:left="120"/>
             </w:pPr>
-            <w:hyperlink w:history="1" r:id="rIdsnyh7nab_hb_myzu_vn7t">
+            <w:hyperlink w:history="1" r:id="rId2r-baflmfzlkg7hqghbfz">
               <w:r>
                 <w:rPr>
                   <w:rFonts w:ascii="Arial" w:cs="Arial" w:eastAsia="Arial" w:hAnsi="Arial"/>
@@ -26880,7 +26880,7 @@
             <w:pPr>
               <w:spacing w:after="20" w:before="0"/>
             </w:pPr>
-            <w:hyperlink w:history="1" r:id="rIdyupa5shii2me4oi6l8a4l">
+            <w:hyperlink w:history="1" r:id="rIdnift9w3uj5xjsbid6_ayx">
               <w:r>
                 <w:rPr>
                   <w:rFonts w:ascii="Arial" w:cs="Arial" w:eastAsia="Arial" w:hAnsi="Arial"/>
@@ -26913,7 +26913,7 @@
               <w:spacing w:after="10" w:before="0"/>
               <w:ind w:left="120"/>
             </w:pPr>
-            <w:hyperlink w:history="1" r:id="rIdtgg7qwirr8xjzxq2sh0gm">
+            <w:hyperlink w:history="1" r:id="rIdl7f7c0vt8yiohpailzy-o">
               <w:r>
                 <w:rPr>
                   <w:rFonts w:ascii="Arial" w:cs="Arial" w:eastAsia="Arial" w:hAnsi="Arial"/>
@@ -26958,7 +26958,7 @@
             <w:pPr>
               <w:spacing w:after="20" w:before="0"/>
             </w:pPr>
-            <w:hyperlink w:history="1" r:id="rIdsswwm3kioqrnz1eth9zk9">
+            <w:hyperlink w:history="1" r:id="rIdsaehwft__9801eqitek8q">
               <w:r>
                 <w:rPr>
                   <w:rFonts w:ascii="Arial" w:cs="Arial" w:eastAsia="Arial" w:hAnsi="Arial"/>
@@ -27007,7 +27007,7 @@
               <w:spacing w:after="10" w:before="0"/>
               <w:ind w:left="120"/>
             </w:pPr>
-            <w:hyperlink w:history="1" r:id="rIdbafn3dh1ycrtpwly4y8rm">
+            <w:hyperlink w:history="1" r:id="rIdan4dtymrf_s1h7okm1ppj">
               <w:r>
                 <w:rPr>
                   <w:rFonts w:ascii="Arial" w:cs="Arial" w:eastAsia="Arial" w:hAnsi="Arial"/>
@@ -27632,7 +27632,7 @@
         </w:rPr>
         <w:t xml:space="preserve">© 2026 SeaVuria and ARES. Aligned with KICD objectives. Developed by SeaVuria; technical implementation by ARES (with AI assistance from Claude). Licensed under </w:t>
       </w:r>
-      <w:hyperlink w:history="1" r:id="rIdzmt7hw-cmpodkjbyv_v-l">
+      <w:hyperlink w:history="1" r:id="rIdkamnpsdm8q8klxfbpy9hs">
         <w:r>
           <w:rPr>
             <w:rFonts w:ascii="Arial" w:cs="Arial" w:eastAsia="Arial" w:hAnsi="Arial"/>
@@ -27653,7 +27653,7 @@
         </w:rPr>
         <w:t xml:space="preserve"> (</w:t>
       </w:r>
-      <w:hyperlink w:history="1" r:id="rIdzzvtwn8fz6ongw6ksz3rd">
+      <w:hyperlink w:history="1" r:id="rIdvxkwy1_-ta1vxzyyqwzni">
         <w:r>
           <w:rPr>
             <w:rFonts w:ascii="Arial" w:cs="Arial" w:eastAsia="Arial" w:hAnsi="Arial"/>
@@ -28693,7 +28693,7 @@
             <w:pPr>
               <w:spacing w:after="20" w:before="0"/>
             </w:pPr>
-            <w:hyperlink w:history="1" r:id="rIdbhqy6nkbgn8vqhlxolb_q">
+            <w:hyperlink w:history="1" r:id="rId8krm46wvuylmvzr-m6-dc">
               <w:r>
                 <w:rPr>
                   <w:rFonts w:ascii="Arial" w:cs="Arial" w:eastAsia="Arial" w:hAnsi="Arial"/>
@@ -28742,7 +28742,7 @@
               <w:spacing w:after="10" w:before="0"/>
               <w:ind w:left="120"/>
             </w:pPr>
-            <w:hyperlink w:history="1" r:id="rIdwtwbcdui6fxckiwdzlrji">
+            <w:hyperlink w:history="1" r:id="rIdn0e2o2lfnwpstvjy9wjng">
               <w:r>
                 <w:rPr>
                   <w:rFonts w:ascii="Arial" w:cs="Arial" w:eastAsia="Arial" w:hAnsi="Arial"/>
@@ -28787,7 +28787,7 @@
             <w:pPr>
               <w:spacing w:after="20" w:before="0"/>
             </w:pPr>
-            <w:hyperlink w:history="1" r:id="rIdqthhofbmu5ie7mfkgid5p">
+            <w:hyperlink w:history="1" r:id="rId-9c-oyfjt266oxuqgra1p">
               <w:r>
                 <w:rPr>
                   <w:rFonts w:ascii="Arial" w:cs="Arial" w:eastAsia="Arial" w:hAnsi="Arial"/>
@@ -28836,7 +28836,7 @@
               <w:spacing w:after="10" w:before="0"/>
               <w:ind w:left="120"/>
             </w:pPr>
-            <w:hyperlink w:history="1" r:id="rIdw5k2x7r4laul7i199849u">
+            <w:hyperlink w:history="1" r:id="rIdicmmrsnuu3xldfrjyapnj">
               <w:r>
                 <w:rPr>
                   <w:rFonts w:ascii="Arial" w:cs="Arial" w:eastAsia="Arial" w:hAnsi="Arial"/>
@@ -29036,7 +29036,7 @@
             <w:pPr>
               <w:spacing w:after="20" w:before="0"/>
             </w:pPr>
-            <w:hyperlink w:history="1" r:id="rIdalfepr8jk5xxhywrqqopo">
+            <w:hyperlink w:history="1" r:id="rIdtmuewyrpcedmedfma4kzw">
               <w:r>
                 <w:rPr>
                   <w:rFonts w:ascii="Arial" w:cs="Arial" w:eastAsia="Arial" w:hAnsi="Arial"/>
@@ -29085,7 +29085,7 @@
               <w:spacing w:after="10" w:before="0"/>
               <w:ind w:left="120"/>
             </w:pPr>
-            <w:hyperlink w:history="1" r:id="rIdbrzgvcku6kabzrmvdwkle">
+            <w:hyperlink w:history="1" r:id="rIdgn3xqojyqj8zgmoidt8sl">
               <w:r>
                 <w:rPr>
                   <w:rFonts w:ascii="Arial" w:cs="Arial" w:eastAsia="Arial" w:hAnsi="Arial"/>
@@ -29130,7 +29130,7 @@
             <w:pPr>
               <w:spacing w:after="20" w:before="0"/>
             </w:pPr>
-            <w:hyperlink w:history="1" r:id="rIdjlvqjjoutg0oqw2gyeexh">
+            <w:hyperlink w:history="1" r:id="rIduc0zj47pcpql9j9igqwwi">
               <w:r>
                 <w:rPr>
                   <w:rFonts w:ascii="Arial" w:cs="Arial" w:eastAsia="Arial" w:hAnsi="Arial"/>
@@ -29179,7 +29179,7 @@
               <w:spacing w:after="10" w:before="0"/>
               <w:ind w:left="120"/>
             </w:pPr>
-            <w:hyperlink w:history="1" r:id="rIdvw625jtdo1gocmddxa21t">
+            <w:hyperlink w:history="1" r:id="rIdec_ruvfinjg2qt4nykfuu">
               <w:r>
                 <w:rPr>
                   <w:rFonts w:ascii="Arial" w:cs="Arial" w:eastAsia="Arial" w:hAnsi="Arial"/>
@@ -29379,7 +29379,7 @@
             <w:pPr>
               <w:spacing w:after="20" w:before="0"/>
             </w:pPr>
-            <w:hyperlink w:history="1" r:id="rIdyaoahevujdwadz24cw26e">
+            <w:hyperlink w:history="1" r:id="rIdganerk-w535c13wp7nphx">
               <w:r>
                 <w:rPr>
                   <w:rFonts w:ascii="Arial" w:cs="Arial" w:eastAsia="Arial" w:hAnsi="Arial"/>
@@ -29428,7 +29428,7 @@
               <w:spacing w:after="10" w:before="0"/>
               <w:ind w:left="120"/>
             </w:pPr>
-            <w:hyperlink w:history="1" r:id="rId1jqydbv0cpms5xnxb9al9">
+            <w:hyperlink w:history="1" r:id="rId6agbdqee8sepmjsmyhmxx">
               <w:r>
                 <w:rPr>
                   <w:rFonts w:ascii="Arial" w:cs="Arial" w:eastAsia="Arial" w:hAnsi="Arial"/>
@@ -29473,7 +29473,7 @@
             <w:pPr>
               <w:spacing w:after="20" w:before="0"/>
             </w:pPr>
-            <w:hyperlink w:history="1" r:id="rIddj8kyqzssgqnx-jgmwhtb">
+            <w:hyperlink w:history="1" r:id="rIdtf6simbqd0gb3a8cjtsjr">
               <w:r>
                 <w:rPr>
                   <w:rFonts w:ascii="Arial" w:cs="Arial" w:eastAsia="Arial" w:hAnsi="Arial"/>
@@ -29522,7 +29522,7 @@
               <w:spacing w:after="10" w:before="0"/>
               <w:ind w:left="120"/>
             </w:pPr>
-            <w:hyperlink w:history="1" r:id="rIdn4whhsutgilmaum5tiymk">
+            <w:hyperlink w:history="1" r:id="rIdxzborftdpzrkzdyhhn56x">
               <w:r>
                 <w:rPr>
                   <w:rFonts w:ascii="Arial" w:cs="Arial" w:eastAsia="Arial" w:hAnsi="Arial"/>
@@ -29722,7 +29722,7 @@
             <w:pPr>
               <w:spacing w:after="20" w:before="0"/>
             </w:pPr>
-            <w:hyperlink w:history="1" r:id="rIdxj2ekwltnnhfnwjusycmn">
+            <w:hyperlink w:history="1" r:id="rIdd7dbid8x94i-knfrvkp8a">
               <w:r>
                 <w:rPr>
                   <w:rFonts w:ascii="Arial" w:cs="Arial" w:eastAsia="Arial" w:hAnsi="Arial"/>
@@ -29771,7 +29771,7 @@
               <w:spacing w:after="10" w:before="0"/>
               <w:ind w:left="120"/>
             </w:pPr>
-            <w:hyperlink w:history="1" r:id="rIdxqvw8qiq8av67ngboacuj">
+            <w:hyperlink w:history="1" r:id="rIduxkylwgjrb9f2g_7olile">
               <w:r>
                 <w:rPr>
                   <w:rFonts w:ascii="Arial" w:cs="Arial" w:eastAsia="Arial" w:hAnsi="Arial"/>
@@ -29816,7 +29816,7 @@
             <w:pPr>
               <w:spacing w:after="20" w:before="0"/>
             </w:pPr>
-            <w:hyperlink w:history="1" r:id="rIdx9_7cdjlez00fvnmqcipe">
+            <w:hyperlink w:history="1" r:id="rIdcejj2xualw2filzajowbv">
               <w:r>
                 <w:rPr>
                   <w:rFonts w:ascii="Arial" w:cs="Arial" w:eastAsia="Arial" w:hAnsi="Arial"/>
@@ -29865,7 +29865,7 @@
               <w:spacing w:after="10" w:before="0"/>
               <w:ind w:left="120"/>
             </w:pPr>
-            <w:hyperlink w:history="1" r:id="rIdqlcd2c5fru0dhnyzqtpke">
+            <w:hyperlink w:history="1" r:id="rIdmwryvc83o6gqbio_gvj_a">
               <w:r>
                 <w:rPr>
                   <w:rFonts w:ascii="Arial" w:cs="Arial" w:eastAsia="Arial" w:hAnsi="Arial"/>
@@ -30065,7 +30065,7 @@
             <w:pPr>
               <w:spacing w:after="20" w:before="0"/>
             </w:pPr>
-            <w:hyperlink w:history="1" r:id="rIdeiljfdlnoyeejwaa5qzwx">
+            <w:hyperlink w:history="1" r:id="rIdizxgjrpfzjirzeyw4incn">
               <w:r>
                 <w:rPr>
                   <w:rFonts w:ascii="Arial" w:cs="Arial" w:eastAsia="Arial" w:hAnsi="Arial"/>
@@ -30114,7 +30114,7 @@
               <w:spacing w:after="10" w:before="0"/>
               <w:ind w:left="120"/>
             </w:pPr>
-            <w:hyperlink w:history="1" r:id="rIdi_oec6hcf0181vvc1ih5j">
+            <w:hyperlink w:history="1" r:id="rId5t7rh2ozyhu80eluljhqi">
               <w:r>
                 <w:rPr>
                   <w:rFonts w:ascii="Arial" w:cs="Arial" w:eastAsia="Arial" w:hAnsi="Arial"/>
@@ -30159,7 +30159,7 @@
             <w:pPr>
               <w:spacing w:after="20" w:before="0"/>
             </w:pPr>
-            <w:hyperlink w:history="1" r:id="rId9fjinsb5ptdahbd8ry3qv">
+            <w:hyperlink w:history="1" r:id="rId8vym84xg74ihimnli3ntd">
               <w:r>
                 <w:rPr>
                   <w:rFonts w:ascii="Arial" w:cs="Arial" w:eastAsia="Arial" w:hAnsi="Arial"/>
@@ -30208,7 +30208,7 @@
               <w:spacing w:after="10" w:before="0"/>
               <w:ind w:left="120"/>
             </w:pPr>
-            <w:hyperlink w:history="1" r:id="rIdbbzqs_yykxibel4utbyff">
+            <w:hyperlink w:history="1" r:id="rIdf3xji95dgaifrybkg1hcl">
               <w:r>
                 <w:rPr>
                   <w:rFonts w:ascii="Arial" w:cs="Arial" w:eastAsia="Arial" w:hAnsi="Arial"/>
@@ -30733,7 +30733,7 @@
         </w:rPr>
         <w:t xml:space="preserve">© 2026 SeaVuria and ARES. Aligned with KICD objectives. Developed by SeaVuria; technical implementation by ARES (with AI assistance from Claude). Licensed under </w:t>
       </w:r>
-      <w:hyperlink w:history="1" r:id="rIdsxel7uc3x5tqe0xymldjq">
+      <w:hyperlink w:history="1" r:id="rIdp4muj6dgbko-s5s7e5wsr">
         <w:r>
           <w:rPr>
             <w:rFonts w:ascii="Arial" w:cs="Arial" w:eastAsia="Arial" w:hAnsi="Arial"/>
@@ -30754,7 +30754,7 @@
         </w:rPr>
         <w:t xml:space="preserve"> (</w:t>
       </w:r>
-      <w:hyperlink w:history="1" r:id="rIdnesdvuwvu40eevicnetgl">
+      <w:hyperlink w:history="1" r:id="rIdy1z8mamnqlqwu3688u-14">
         <w:r>
           <w:rPr>
             <w:rFonts w:ascii="Arial" w:cs="Arial" w:eastAsia="Arial" w:hAnsi="Arial"/>
@@ -31794,7 +31794,7 @@
             <w:pPr>
               <w:spacing w:after="20" w:before="0"/>
             </w:pPr>
-            <w:hyperlink w:history="1" r:id="rIdii9ii5alyteaxguzntmpk">
+            <w:hyperlink w:history="1" r:id="rIdde5r1lz31s8_uhleczkve">
               <w:r>
                 <w:rPr>
                   <w:rFonts w:ascii="Arial" w:cs="Arial" w:eastAsia="Arial" w:hAnsi="Arial"/>
@@ -31827,7 +31827,7 @@
               <w:spacing w:after="10" w:before="0"/>
               <w:ind w:left="120"/>
             </w:pPr>
-            <w:hyperlink w:history="1" r:id="rId1ynuqvius6afrzyxkxufb">
+            <w:hyperlink w:history="1" r:id="rIdgc_e-iizqba2xbzxlwpxl">
               <w:r>
                 <w:rPr>
                   <w:rFonts w:ascii="Arial" w:cs="Arial" w:eastAsia="Arial" w:hAnsi="Arial"/>
@@ -31872,7 +31872,7 @@
             <w:pPr>
               <w:spacing w:after="20" w:before="0"/>
             </w:pPr>
-            <w:hyperlink w:history="1" r:id="rIdmfnpqouq2v_hz-ohee4f1">
+            <w:hyperlink w:history="1" r:id="rId0ak2hd73qrkrra7m8iqcm">
               <w:r>
                 <w:rPr>
                   <w:rFonts w:ascii="Arial" w:cs="Arial" w:eastAsia="Arial" w:hAnsi="Arial"/>
@@ -31921,7 +31921,7 @@
               <w:spacing w:after="10" w:before="0"/>
               <w:ind w:left="120"/>
             </w:pPr>
-            <w:hyperlink w:history="1" r:id="rIdssdedcqwtt0-ntd6ouzyp">
+            <w:hyperlink w:history="1" r:id="rIdmqrjycmqlxwtx4o3y5dvu">
               <w:r>
                 <w:rPr>
                   <w:rFonts w:ascii="Arial" w:cs="Arial" w:eastAsia="Arial" w:hAnsi="Arial"/>
@@ -32121,7 +32121,7 @@
             <w:pPr>
               <w:spacing w:after="20" w:before="0"/>
             </w:pPr>
-            <w:hyperlink w:history="1" r:id="rIde4vwjcy_iugvt3vujaplh">
+            <w:hyperlink w:history="1" r:id="rIdba3b1ofhv08wrgkjvrm_l">
               <w:r>
                 <w:rPr>
                   <w:rFonts w:ascii="Arial" w:cs="Arial" w:eastAsia="Arial" w:hAnsi="Arial"/>
@@ -32154,7 +32154,7 @@
               <w:spacing w:after="10" w:before="0"/>
               <w:ind w:left="120"/>
             </w:pPr>
-            <w:hyperlink w:history="1" r:id="rId6nqetv5gopmqjsnc9gkak">
+            <w:hyperlink w:history="1" r:id="rId0ok0ixluns5-khvosfybv">
               <w:r>
                 <w:rPr>
                   <w:rFonts w:ascii="Arial" w:cs="Arial" w:eastAsia="Arial" w:hAnsi="Arial"/>
@@ -32199,7 +32199,7 @@
             <w:pPr>
               <w:spacing w:after="20" w:before="0"/>
             </w:pPr>
-            <w:hyperlink w:history="1" r:id="rIdxlcrzkj7vygnd2007fey9">
+            <w:hyperlink w:history="1" r:id="rIdgmqqarhkajyq40yrbefy4">
               <w:r>
                 <w:rPr>
                   <w:rFonts w:ascii="Arial" w:cs="Arial" w:eastAsia="Arial" w:hAnsi="Arial"/>
@@ -32248,7 +32248,7 @@
               <w:spacing w:after="10" w:before="0"/>
               <w:ind w:left="120"/>
             </w:pPr>
-            <w:hyperlink w:history="1" r:id="rIdydatmotw6oa7t6a0_fjhv">
+            <w:hyperlink w:history="1" r:id="rIdenwgbytbnfksxgw5ywvba">
               <w:r>
                 <w:rPr>
                   <w:rFonts w:ascii="Arial" w:cs="Arial" w:eastAsia="Arial" w:hAnsi="Arial"/>
@@ -32448,7 +32448,7 @@
             <w:pPr>
               <w:spacing w:after="20" w:before="0"/>
             </w:pPr>
-            <w:hyperlink w:history="1" r:id="rId3sfggkjjhg2gjdcezsizk">
+            <w:hyperlink w:history="1" r:id="rIdp9bcrlchpsuo8hraocquc">
               <w:r>
                 <w:rPr>
                   <w:rFonts w:ascii="Arial" w:cs="Arial" w:eastAsia="Arial" w:hAnsi="Arial"/>
@@ -32497,7 +32497,7 @@
               <w:spacing w:after="10" w:before="0"/>
               <w:ind w:left="120"/>
             </w:pPr>
-            <w:hyperlink w:history="1" r:id="rIdv3wiznuakoula1pi2kk-m">
+            <w:hyperlink w:history="1" r:id="rIdda9o2ot4q0nll3t0qplif">
               <w:r>
                 <w:rPr>
                   <w:rFonts w:ascii="Arial" w:cs="Arial" w:eastAsia="Arial" w:hAnsi="Arial"/>
@@ -32542,7 +32542,7 @@
             <w:pPr>
               <w:spacing w:after="20" w:before="0"/>
             </w:pPr>
-            <w:hyperlink w:history="1" r:id="rId4dauh7ayqwke0k20kyx1u">
+            <w:hyperlink w:history="1" r:id="rIdgh8lryigkk64aq-1793ks">
               <w:r>
                 <w:rPr>
                   <w:rFonts w:ascii="Arial" w:cs="Arial" w:eastAsia="Arial" w:hAnsi="Arial"/>
@@ -32591,7 +32591,7 @@
               <w:spacing w:after="10" w:before="0"/>
               <w:ind w:left="120"/>
             </w:pPr>
-            <w:hyperlink w:history="1" r:id="rIdjt6e3yi9qsk6ox9td5nbq">
+            <w:hyperlink w:history="1" r:id="rIdvafrs90rp-hr-hnltgrce">
               <w:r>
                 <w:rPr>
                   <w:rFonts w:ascii="Arial" w:cs="Arial" w:eastAsia="Arial" w:hAnsi="Arial"/>
@@ -32791,7 +32791,7 @@
             <w:pPr>
               <w:spacing w:after="20" w:before="0"/>
             </w:pPr>
-            <w:hyperlink w:history="1" r:id="rIdxw1q2jqswhnqzidyrauf1">
+            <w:hyperlink w:history="1" r:id="rIdmcowljl0bupoyi6zfqi1w">
               <w:r>
                 <w:rPr>
                   <w:rFonts w:ascii="Arial" w:cs="Arial" w:eastAsia="Arial" w:hAnsi="Arial"/>
@@ -32840,7 +32840,7 @@
               <w:spacing w:after="10" w:before="0"/>
               <w:ind w:left="120"/>
             </w:pPr>
-            <w:hyperlink w:history="1" r:id="rIdao9bg1fykgw_ofeudzpps">
+            <w:hyperlink w:history="1" r:id="rIdb6li50tdeh0krsrfwfwti">
               <w:r>
                 <w:rPr>
                   <w:rFonts w:ascii="Arial" w:cs="Arial" w:eastAsia="Arial" w:hAnsi="Arial"/>
@@ -32885,7 +32885,7 @@
             <w:pPr>
               <w:spacing w:after="20" w:before="0"/>
             </w:pPr>
-            <w:hyperlink w:history="1" r:id="rIdglpoaayptornouu_bxpoz">
+            <w:hyperlink w:history="1" r:id="rIdjvvnknn4qmssasl8caekk">
               <w:r>
                 <w:rPr>
                   <w:rFonts w:ascii="Arial" w:cs="Arial" w:eastAsia="Arial" w:hAnsi="Arial"/>
@@ -32934,7 +32934,7 @@
               <w:spacing w:after="10" w:before="0"/>
               <w:ind w:left="120"/>
             </w:pPr>
-            <w:hyperlink w:history="1" r:id="rIdqpl0znubxkrmwvknrlokp">
+            <w:hyperlink w:history="1" r:id="rIdqdfjnwtwzz90qbtzjp5k_">
               <w:r>
                 <w:rPr>
                   <w:rFonts w:ascii="Arial" w:cs="Arial" w:eastAsia="Arial" w:hAnsi="Arial"/>
@@ -33134,7 +33134,7 @@
             <w:pPr>
               <w:spacing w:after="20" w:before="0"/>
             </w:pPr>
-            <w:hyperlink w:history="1" r:id="rIdpoeei_hpnpn_wv9jn4bqf">
+            <w:hyperlink w:history="1" r:id="rIdf6xkxyn9l8ewlh7qiiaqi">
               <w:r>
                 <w:rPr>
                   <w:rFonts w:ascii="Arial" w:cs="Arial" w:eastAsia="Arial" w:hAnsi="Arial"/>
@@ -33183,7 +33183,7 @@
               <w:spacing w:after="10" w:before="0"/>
               <w:ind w:left="120"/>
             </w:pPr>
-            <w:hyperlink w:history="1" r:id="rIdk2fumf18l2ng1ugvdixpc">
+            <w:hyperlink w:history="1" r:id="rIdis6hfpjm6gnekriu1flru">
               <w:r>
                 <w:rPr>
                   <w:rFonts w:ascii="Arial" w:cs="Arial" w:eastAsia="Arial" w:hAnsi="Arial"/>
@@ -33228,7 +33228,7 @@
             <w:pPr>
               <w:spacing w:after="20" w:before="0"/>
             </w:pPr>
-            <w:hyperlink w:history="1" r:id="rId0vitffkvmiexkm_egfkpv">
+            <w:hyperlink w:history="1" r:id="rIdljhxbmprwepkv2lixpgsq">
               <w:r>
                 <w:rPr>
                   <w:rFonts w:ascii="Arial" w:cs="Arial" w:eastAsia="Arial" w:hAnsi="Arial"/>
@@ -33277,7 +33277,7 @@
               <w:spacing w:after="10" w:before="0"/>
               <w:ind w:left="120"/>
             </w:pPr>
-            <w:hyperlink w:history="1" r:id="rIdicvvdf84bz4he30md1nmf">
+            <w:hyperlink w:history="1" r:id="rIdlz2ubb802sbioiuv6epil">
               <w:r>
                 <w:rPr>
                   <w:rFonts w:ascii="Arial" w:cs="Arial" w:eastAsia="Arial" w:hAnsi="Arial"/>
@@ -33902,7 +33902,7 @@
         </w:rPr>
         <w:t xml:space="preserve">© 2026 SeaVuria and ARES. Aligned with KICD objectives. Developed by SeaVuria; technical implementation by ARES (with AI assistance from Claude). Licensed under </w:t>
       </w:r>
-      <w:hyperlink w:history="1" r:id="rId0xf6vfvzdqwdhvqgwk92-">
+      <w:hyperlink w:history="1" r:id="rIdj1kwohvrd4ner0b5lmqoj">
         <w:r>
           <w:rPr>
             <w:rFonts w:ascii="Arial" w:cs="Arial" w:eastAsia="Arial" w:hAnsi="Arial"/>
@@ -33923,7 +33923,7 @@
         </w:rPr>
         <w:t xml:space="preserve"> (</w:t>
       </w:r>
-      <w:hyperlink w:history="1" r:id="rIdadgjtfa2wewrswr62wlff">
+      <w:hyperlink w:history="1" r:id="rId9td88sjgggjv-ck8_bnd1">
         <w:r>
           <w:rPr>
             <w:rFonts w:ascii="Arial" w:cs="Arial" w:eastAsia="Arial" w:hAnsi="Arial"/>
@@ -34963,7 +34963,7 @@
             <w:pPr>
               <w:spacing w:after="20" w:before="0"/>
             </w:pPr>
-            <w:hyperlink w:history="1" r:id="rIdkg7id8mvdpyutxg-zunyd">
+            <w:hyperlink w:history="1" r:id="rIdyqinuynzwcnllsk66-2un">
               <w:r>
                 <w:rPr>
                   <w:rFonts w:ascii="Arial" w:cs="Arial" w:eastAsia="Arial" w:hAnsi="Arial"/>
@@ -34996,7 +34996,7 @@
               <w:spacing w:after="10" w:before="0"/>
               <w:ind w:left="120"/>
             </w:pPr>
-            <w:hyperlink w:history="1" r:id="rIde3qh3hmxuefgdcbnvep_u">
+            <w:hyperlink w:history="1" r:id="rIdyy1fqp5dafnroq6urs9ua">
               <w:r>
                 <w:rPr>
                   <w:rFonts w:ascii="Arial" w:cs="Arial" w:eastAsia="Arial" w:hAnsi="Arial"/>
@@ -35041,7 +35041,7 @@
             <w:pPr>
               <w:spacing w:after="20" w:before="0"/>
             </w:pPr>
-            <w:hyperlink w:history="1" r:id="rIds0jl-bfndkwchmlpu1kmk">
+            <w:hyperlink w:history="1" r:id="rIdvvbueu4exaowibejkn9pv">
               <w:r>
                 <w:rPr>
                   <w:rFonts w:ascii="Arial" w:cs="Arial" w:eastAsia="Arial" w:hAnsi="Arial"/>
@@ -35074,7 +35074,7 @@
               <w:spacing w:after="10" w:before="0"/>
               <w:ind w:left="120"/>
             </w:pPr>
-            <w:hyperlink w:history="1" r:id="rIdx1b9pvuiges-smwrizyzb">
+            <w:hyperlink w:history="1" r:id="rIdpd01mklz3rbhtgjbgapt2">
               <w:r>
                 <w:rPr>
                   <w:rFonts w:ascii="Arial" w:cs="Arial" w:eastAsia="Arial" w:hAnsi="Arial"/>
@@ -35274,7 +35274,7 @@
             <w:pPr>
               <w:spacing w:after="20" w:before="0"/>
             </w:pPr>
-            <w:hyperlink w:history="1" r:id="rIdgdi5xqkfcskwikcvlmsah">
+            <w:hyperlink w:history="1" r:id="rIdjbsdcm0rrahdwlgrpqsnl">
               <w:r>
                 <w:rPr>
                   <w:rFonts w:ascii="Arial" w:cs="Arial" w:eastAsia="Arial" w:hAnsi="Arial"/>
@@ -35307,7 +35307,7 @@
               <w:spacing w:after="10" w:before="0"/>
               <w:ind w:left="120"/>
             </w:pPr>
-            <w:hyperlink w:history="1" r:id="rIdzi_ijhbpzade7cllnkew_">
+            <w:hyperlink w:history="1" r:id="rIdmbljd-bgejdq2wyujnurg">
               <w:r>
                 <w:rPr>
                   <w:rFonts w:ascii="Arial" w:cs="Arial" w:eastAsia="Arial" w:hAnsi="Arial"/>
@@ -35352,7 +35352,7 @@
             <w:pPr>
               <w:spacing w:after="20" w:before="0"/>
             </w:pPr>
-            <w:hyperlink w:history="1" r:id="rId2cbje0vbhb6x1yecen6f5">
+            <w:hyperlink w:history="1" r:id="rIdqshfnsiwermjqvfsrxskf">
               <w:r>
                 <w:rPr>
                   <w:rFonts w:ascii="Arial" w:cs="Arial" w:eastAsia="Arial" w:hAnsi="Arial"/>
@@ -35385,7 +35385,7 @@
               <w:spacing w:after="10" w:before="0"/>
               <w:ind w:left="120"/>
             </w:pPr>
-            <w:hyperlink w:history="1" r:id="rId99mq0e9r_-0pj5hjtbiax">
+            <w:hyperlink w:history="1" r:id="rId6btxuppzdubuppkve7o_v">
               <w:r>
                 <w:rPr>
                   <w:rFonts w:ascii="Arial" w:cs="Arial" w:eastAsia="Arial" w:hAnsi="Arial"/>
@@ -35585,7 +35585,7 @@
             <w:pPr>
               <w:spacing w:after="20" w:before="0"/>
             </w:pPr>
-            <w:hyperlink w:history="1" r:id="rIdn6vfvyvn9knltijizhond">
+            <w:hyperlink w:history="1" r:id="rIdgohiey8lvxingspzlvwq4">
               <w:r>
                 <w:rPr>
                   <w:rFonts w:ascii="Arial" w:cs="Arial" w:eastAsia="Arial" w:hAnsi="Arial"/>
@@ -35618,7 +35618,7 @@
               <w:spacing w:after="10" w:before="0"/>
               <w:ind w:left="120"/>
             </w:pPr>
-            <w:hyperlink w:history="1" r:id="rIdxvt3bqkxijfz4-ngl3bs9">
+            <w:hyperlink w:history="1" r:id="rIdbrps7cbaul_pnxfklehgm">
               <w:r>
                 <w:rPr>
                   <w:rFonts w:ascii="Arial" w:cs="Arial" w:eastAsia="Arial" w:hAnsi="Arial"/>
@@ -35663,7 +35663,7 @@
             <w:pPr>
               <w:spacing w:after="20" w:before="0"/>
             </w:pPr>
-            <w:hyperlink w:history="1" r:id="rIdtee6vnd3foauvy3wfqasb">
+            <w:hyperlink w:history="1" r:id="rIdnvcbtfdassnsewrmrk2qr">
               <w:r>
                 <w:rPr>
                   <w:rFonts w:ascii="Arial" w:cs="Arial" w:eastAsia="Arial" w:hAnsi="Arial"/>
@@ -35712,7 +35712,7 @@
               <w:spacing w:after="10" w:before="0"/>
               <w:ind w:left="120"/>
             </w:pPr>
-            <w:hyperlink w:history="1" r:id="rIdjiq7gqghk43pbpkoh7qds">
+            <w:hyperlink w:history="1" r:id="rIdi6bjujsg5znuiqpuiysyq">
               <w:r>
                 <w:rPr>
                   <w:rFonts w:ascii="Arial" w:cs="Arial" w:eastAsia="Arial" w:hAnsi="Arial"/>
@@ -35912,7 +35912,7 @@
             <w:pPr>
               <w:spacing w:after="20" w:before="0"/>
             </w:pPr>
-            <w:hyperlink w:history="1" r:id="rIdwj7mlbxddoo5q8e0kznvs">
+            <w:hyperlink w:history="1" r:id="rId1e9xndvbfta3cbznv2wjz">
               <w:r>
                 <w:rPr>
                   <w:rFonts w:ascii="Arial" w:cs="Arial" w:eastAsia="Arial" w:hAnsi="Arial"/>
@@ -35945,7 +35945,7 @@
               <w:spacing w:after="10" w:before="0"/>
               <w:ind w:left="120"/>
             </w:pPr>
-            <w:hyperlink w:history="1" r:id="rIdelny41xxkubl0udnc82km">
+            <w:hyperlink w:history="1" r:id="rId1kgzjigydgmcrs6i6ogyd">
               <w:r>
                 <w:rPr>
                   <w:rFonts w:ascii="Arial" w:cs="Arial" w:eastAsia="Arial" w:hAnsi="Arial"/>
@@ -35990,7 +35990,7 @@
             <w:pPr>
               <w:spacing w:after="20" w:before="0"/>
             </w:pPr>
-            <w:hyperlink w:history="1" r:id="rIdem0bz9awberli8u9pdd8s">
+            <w:hyperlink w:history="1" r:id="rIdlpuah6ksv6iod0riibjim">
               <w:r>
                 <w:rPr>
                   <w:rFonts w:ascii="Arial" w:cs="Arial" w:eastAsia="Arial" w:hAnsi="Arial"/>
@@ -36039,7 +36039,7 @@
               <w:spacing w:after="10" w:before="0"/>
               <w:ind w:left="120"/>
             </w:pPr>
-            <w:hyperlink w:history="1" r:id="rIdb_wztoocu9igto0ri1wwb">
+            <w:hyperlink w:history="1" r:id="rIdn_cofjn5dtsweebv6sdda">
               <w:r>
                 <w:rPr>
                   <w:rFonts w:ascii="Arial" w:cs="Arial" w:eastAsia="Arial" w:hAnsi="Arial"/>
@@ -36239,7 +36239,7 @@
             <w:pPr>
               <w:spacing w:after="20" w:before="0"/>
             </w:pPr>
-            <w:hyperlink w:history="1" r:id="rIdw4bghmyz2dksyzl7tnx7i">
+            <w:hyperlink w:history="1" r:id="rId6vaknuy9gsr9myeezgr3-">
               <w:r>
                 <w:rPr>
                   <w:rFonts w:ascii="Arial" w:cs="Arial" w:eastAsia="Arial" w:hAnsi="Arial"/>
@@ -36272,7 +36272,7 @@
               <w:spacing w:after="10" w:before="0"/>
               <w:ind w:left="120"/>
             </w:pPr>
-            <w:hyperlink w:history="1" r:id="rIdzso0wby7uhidszffumoov">
+            <w:hyperlink w:history="1" r:id="rIdym0ot6btodzmd8w1a_mhx">
               <w:r>
                 <w:rPr>
                   <w:rFonts w:ascii="Arial" w:cs="Arial" w:eastAsia="Arial" w:hAnsi="Arial"/>
@@ -36317,7 +36317,7 @@
             <w:pPr>
               <w:spacing w:after="20" w:before="0"/>
             </w:pPr>
-            <w:hyperlink w:history="1" r:id="rIdpmpry_e8it5cyngpxbhzb">
+            <w:hyperlink w:history="1" r:id="rIdgqqnwnz47iejufnu1hdus">
               <w:r>
                 <w:rPr>
                   <w:rFonts w:ascii="Arial" w:cs="Arial" w:eastAsia="Arial" w:hAnsi="Arial"/>
@@ -36366,7 +36366,7 @@
               <w:spacing w:after="10" w:before="0"/>
               <w:ind w:left="120"/>
             </w:pPr>
-            <w:hyperlink w:history="1" r:id="rIdkuvt4wqylnwzf102kxcut">
+            <w:hyperlink w:history="1" r:id="rId6z6k-930lauu2gsluf0rl">
               <w:r>
                 <w:rPr>
                   <w:rFonts w:ascii="Arial" w:cs="Arial" w:eastAsia="Arial" w:hAnsi="Arial"/>
@@ -36891,7 +36891,7 @@
         </w:rPr>
         <w:t xml:space="preserve">© 2026 SeaVuria and ARES. Aligned with KICD objectives. Developed by SeaVuria; technical implementation by ARES (with AI assistance from Claude). Licensed under </w:t>
       </w:r>
-      <w:hyperlink w:history="1" r:id="rIdy5oasqghpiux4b5mfe1j1">
+      <w:hyperlink w:history="1" r:id="rIdc91wsvgog7d9xouqahuov">
         <w:r>
           <w:rPr>
             <w:rFonts w:ascii="Arial" w:cs="Arial" w:eastAsia="Arial" w:hAnsi="Arial"/>
@@ -36912,7 +36912,7 @@
         </w:rPr>
         <w:t xml:space="preserve"> (</w:t>
       </w:r>
-      <w:hyperlink w:history="1" r:id="rIddbglduf17g7-f1cgcf21f">
+      <w:hyperlink w:history="1" r:id="rId5y-mqhwrgk9hmfkklxs9c">
         <w:r>
           <w:rPr>
             <w:rFonts w:ascii="Arial" w:cs="Arial" w:eastAsia="Arial" w:hAnsi="Arial"/>
@@ -37952,7 +37952,7 @@
             <w:pPr>
               <w:spacing w:after="20" w:before="0"/>
             </w:pPr>
-            <w:hyperlink w:history="1" r:id="rIdtqjzb_lw4fwkrxn3g9n1r">
+            <w:hyperlink w:history="1" r:id="rId3raumke-k60-zc717cl8a">
               <w:r>
                 <w:rPr>
                   <w:rFonts w:ascii="Arial" w:cs="Arial" w:eastAsia="Arial" w:hAnsi="Arial"/>
@@ -37985,7 +37985,7 @@
               <w:spacing w:after="10" w:before="0"/>
               <w:ind w:left="120"/>
             </w:pPr>
-            <w:hyperlink w:history="1" r:id="rIdapqkihy_g9kdwobvcl0vu">
+            <w:hyperlink w:history="1" r:id="rIdaxtfcb_tjnczrubtz_emj">
               <w:r>
                 <w:rPr>
                   <w:rFonts w:ascii="Arial" w:cs="Arial" w:eastAsia="Arial" w:hAnsi="Arial"/>
@@ -38030,7 +38030,7 @@
             <w:pPr>
               <w:spacing w:after="20" w:before="0"/>
             </w:pPr>
-            <w:hyperlink w:history="1" r:id="rIdzuwaoz_kjhzjdnz667lq_">
+            <w:hyperlink w:history="1" r:id="rIdzcgplho4ng4xlypb-uksq">
               <w:r>
                 <w:rPr>
                   <w:rFonts w:ascii="Arial" w:cs="Arial" w:eastAsia="Arial" w:hAnsi="Arial"/>
@@ -38063,7 +38063,7 @@
               <w:spacing w:after="10" w:before="0"/>
               <w:ind w:left="120"/>
             </w:pPr>
-            <w:hyperlink w:history="1" r:id="rIdbty55viugvc_mtzx7y-6a">
+            <w:hyperlink w:history="1" r:id="rId9xi5nphqdetcaemuafcny">
               <w:r>
                 <w:rPr>
                   <w:rFonts w:ascii="Arial" w:cs="Arial" w:eastAsia="Arial" w:hAnsi="Arial"/>
@@ -38423,7 +38423,7 @@
             <w:pPr>
               <w:spacing w:after="20" w:before="0"/>
             </w:pPr>
-            <w:hyperlink w:history="1" r:id="rId6gzodvbhggsaiapppg1ei">
+            <w:hyperlink w:history="1" r:id="rId55h-qjp4drpbnjboayubh">
               <w:r>
                 <w:rPr>
                   <w:rFonts w:ascii="Arial" w:cs="Arial" w:eastAsia="Arial" w:hAnsi="Arial"/>
@@ -38456,7 +38456,7 @@
               <w:spacing w:after="10" w:before="0"/>
               <w:ind w:left="120"/>
             </w:pPr>
-            <w:hyperlink w:history="1" r:id="rIdvmor_ksckvlv7qmn3zqvu">
+            <w:hyperlink w:history="1" r:id="rIdiodfutwvw4v-dtecix6nh">
               <w:r>
                 <w:rPr>
                   <w:rFonts w:ascii="Arial" w:cs="Arial" w:eastAsia="Arial" w:hAnsi="Arial"/>
@@ -38501,7 +38501,7 @@
             <w:pPr>
               <w:spacing w:after="20" w:before="0"/>
             </w:pPr>
-            <w:hyperlink w:history="1" r:id="rIdwb4t4oeliepspbkuaa1bu">
+            <w:hyperlink w:history="1" r:id="rIdahlia7cd-jk-paxy1a6jl">
               <w:r>
                 <w:rPr>
                   <w:rFonts w:ascii="Arial" w:cs="Arial" w:eastAsia="Arial" w:hAnsi="Arial"/>
@@ -38534,7 +38534,7 @@
               <w:spacing w:after="10" w:before="0"/>
               <w:ind w:left="120"/>
             </w:pPr>
-            <w:hyperlink w:history="1" r:id="rIdmplbhstkm1zgcovjkz-yb">
+            <w:hyperlink w:history="1" r:id="rId-myoapnrea2ilh4wpikfz">
               <w:r>
                 <w:rPr>
                   <w:rFonts w:ascii="Arial" w:cs="Arial" w:eastAsia="Arial" w:hAnsi="Arial"/>
@@ -39054,7 +39054,7 @@
             <w:pPr>
               <w:spacing w:after="20" w:before="0"/>
             </w:pPr>
-            <w:hyperlink w:history="1" r:id="rIdqlae5gci0rml9faphz6pp">
+            <w:hyperlink w:history="1" r:id="rIdircy2kegl0y5n86pn12dv">
               <w:r>
                 <w:rPr>
                   <w:rFonts w:ascii="Arial" w:cs="Arial" w:eastAsia="Arial" w:hAnsi="Arial"/>
@@ -39087,7 +39087,7 @@
               <w:spacing w:after="10" w:before="0"/>
               <w:ind w:left="120"/>
             </w:pPr>
-            <w:hyperlink w:history="1" r:id="rIdxwwj9gwraxytemwr6crz7">
+            <w:hyperlink w:history="1" r:id="rIdkb832w0zjmdcgglyiuwkn">
               <w:r>
                 <w:rPr>
                   <w:rFonts w:ascii="Arial" w:cs="Arial" w:eastAsia="Arial" w:hAnsi="Arial"/>
@@ -39132,7 +39132,7 @@
             <w:pPr>
               <w:spacing w:after="20" w:before="0"/>
             </w:pPr>
-            <w:hyperlink w:history="1" r:id="rIdr8ydk6_1jyf31h-isxyqb">
+            <w:hyperlink w:history="1" r:id="rIdxmojjt3ezpkhx7nngxvyk">
               <w:r>
                 <w:rPr>
                   <w:rFonts w:ascii="Arial" w:cs="Arial" w:eastAsia="Arial" w:hAnsi="Arial"/>
@@ -39181,7 +39181,7 @@
               <w:spacing w:after="10" w:before="0"/>
               <w:ind w:left="120"/>
             </w:pPr>
-            <w:hyperlink w:history="1" r:id="rIdu_cqkxpmvrpfoonq2fsqv">
+            <w:hyperlink w:history="1" r:id="rId9pdfxg5bykcvp-fmt6yml">
               <w:r>
                 <w:rPr>
                   <w:rFonts w:ascii="Arial" w:cs="Arial" w:eastAsia="Arial" w:hAnsi="Arial"/>
@@ -39601,7 +39601,7 @@
             <w:pPr>
               <w:spacing w:after="20" w:before="0"/>
             </w:pPr>
-            <w:hyperlink w:history="1" r:id="rIdh3b2jbbcmbdtj829yz2z1">
+            <w:hyperlink w:history="1" r:id="rIdmtrxqi-5lp9pppdf75xb-">
               <w:r>
                 <w:rPr>
                   <w:rFonts w:ascii="Arial" w:cs="Arial" w:eastAsia="Arial" w:hAnsi="Arial"/>
@@ -39634,7 +39634,7 @@
               <w:spacing w:after="10" w:before="0"/>
               <w:ind w:left="120"/>
             </w:pPr>
-            <w:hyperlink w:history="1" r:id="rIdd4uccj6qmhbyiclc3bzvo">
+            <w:hyperlink w:history="1" r:id="rIdsyuvub47zyqd-2gsufebo">
               <w:r>
                 <w:rPr>
                   <w:rFonts w:ascii="Arial" w:cs="Arial" w:eastAsia="Arial" w:hAnsi="Arial"/>
@@ -39679,7 +39679,7 @@
             <w:pPr>
               <w:spacing w:after="20" w:before="0"/>
             </w:pPr>
-            <w:hyperlink w:history="1" r:id="rIdcbfxziwttckovcqkq1khb">
+            <w:hyperlink w:history="1" r:id="rIdabystz4wg9axtibi1d-va">
               <w:r>
                 <w:rPr>
                   <w:rFonts w:ascii="Arial" w:cs="Arial" w:eastAsia="Arial" w:hAnsi="Arial"/>
@@ -39728,7 +39728,7 @@
               <w:spacing w:after="10" w:before="0"/>
               <w:ind w:left="120"/>
             </w:pPr>
-            <w:hyperlink w:history="1" r:id="rIddypzyynplcodhjklgwzey">
+            <w:hyperlink w:history="1" r:id="rId3czojkmep5cqa-lezqd0c">
               <w:r>
                 <w:rPr>
                   <w:rFonts w:ascii="Arial" w:cs="Arial" w:eastAsia="Arial" w:hAnsi="Arial"/>
@@ -40188,7 +40188,7 @@
             <w:pPr>
               <w:spacing w:after="20" w:before="0"/>
             </w:pPr>
-            <w:hyperlink w:history="1" r:id="rId6zjgvprlbp15zopgpa_jc">
+            <w:hyperlink w:history="1" r:id="rIdpj6o0dxbv-8bwd1vnxkwz">
               <w:r>
                 <w:rPr>
                   <w:rFonts w:ascii="Arial" w:cs="Arial" w:eastAsia="Arial" w:hAnsi="Arial"/>
@@ -40221,7 +40221,7 @@
               <w:spacing w:after="10" w:before="0"/>
               <w:ind w:left="120"/>
             </w:pPr>
-            <w:hyperlink w:history="1" r:id="rIduapy7oogtynglehmou546">
+            <w:hyperlink w:history="1" r:id="rIdsxozyvmljcde2atsb0i1q">
               <w:r>
                 <w:rPr>
                   <w:rFonts w:ascii="Arial" w:cs="Arial" w:eastAsia="Arial" w:hAnsi="Arial"/>
@@ -40266,7 +40266,7 @@
             <w:pPr>
               <w:spacing w:after="20" w:before="0"/>
             </w:pPr>
-            <w:hyperlink w:history="1" r:id="rIdh0a9xav58rvubedocom-7">
+            <w:hyperlink w:history="1" r:id="rIdzozmhho1w3phhtxrj-1me">
               <w:r>
                 <w:rPr>
                   <w:rFonts w:ascii="Arial" w:cs="Arial" w:eastAsia="Arial" w:hAnsi="Arial"/>
@@ -40315,7 +40315,7 @@
               <w:spacing w:after="10" w:before="0"/>
               <w:ind w:left="120"/>
             </w:pPr>
-            <w:hyperlink w:history="1" r:id="rIdptdjplycqaya-gnvvhulu">
+            <w:hyperlink w:history="1" r:id="rIdenignaq8uwtfzcllurcfw">
               <w:r>
                 <w:rPr>
                   <w:rFonts w:ascii="Arial" w:cs="Arial" w:eastAsia="Arial" w:hAnsi="Arial"/>
@@ -41000,7 +41000,7 @@
         </w:rPr>
         <w:t xml:space="preserve">© 2026 SeaVuria and ARES. Aligned with KICD objectives. Developed by SeaVuria; technical implementation by ARES (with AI assistance from Claude). Licensed under </w:t>
       </w:r>
-      <w:hyperlink w:history="1" r:id="rIdnrwgnxo8bylzvnrktw-4e">
+      <w:hyperlink w:history="1" r:id="rId3oqccxoxkssztdin0zgki">
         <w:r>
           <w:rPr>
             <w:rFonts w:ascii="Arial" w:cs="Arial" w:eastAsia="Arial" w:hAnsi="Arial"/>
@@ -41021,7 +41021,7 @@
         </w:rPr>
         <w:t xml:space="preserve"> (</w:t>
       </w:r>
-      <w:hyperlink w:history="1" r:id="rIddrsr8yyv_kvhn2pjdcmfq">
+      <w:hyperlink w:history="1" r:id="rIdzdvjrrmyftovsijcz5p77">
         <w:r>
           <w:rPr>
             <w:rFonts w:ascii="Arial" w:cs="Arial" w:eastAsia="Arial" w:hAnsi="Arial"/>

</xml_diff>